<commit_message>
update WIS2 Guide build
</commit_message>
<xml_diff>
--- a/cookbook/wis2-cookbook-DRAFT.docx
+++ b/cookbook/wis2-cookbook-DRAFT.docx
@@ -21,7 +21,7 @@
         <w:pStyle w:val="Date"/>
       </w:pPr>
       <w:r>
-        <w:t xml:space="preserve">2026-06-11</w:t>
+        <w:t xml:space="preserve">2026-08-13</w:t>
       </w:r>
     </w:p>
     <w:p>
@@ -74,7 +74,7 @@
               <w:jc w:val="left"/>
             </w:pPr>
             <w:r>
-              <w:t xml:space="preserve">Date: 2026-06-11</w:t>
+              <w:t xml:space="preserve">Date: 2026-08-13</w:t>
             </w:r>
           </w:p>
         </w:tc>
@@ -1677,7 +1677,7 @@
     </w:p>
     <w:bookmarkEnd w:id="43"/>
     <w:bookmarkEnd w:id="44"/>
-    <w:bookmarkStart w:id="129" w:name="Xc5829fea4e901e6afa306ccbaf00b6870c57aed"/>
+    <w:bookmarkStart w:id="142" w:name="Xc5829fea4e901e6afa306ccbaf00b6870c57aed"/>
     <w:p>
       <w:pPr>
         <w:pStyle w:val="Heading1"/>
@@ -1686,13 +1686,13 @@
         <w:t xml:space="preserve">Recipes for data publishers</w:t>
       </w:r>
     </w:p>
-    <w:bookmarkStart w:id="47" w:name="X9ec1a7498bcfb36243b04077bc9f17c25c5b48a"/>
+    <w:bookmarkStart w:id="54" w:name="X3e8d2419d5a99053dcddcc4b6eef9eb40aa8ddd"/>
     <w:p>
       <w:pPr>
         <w:pStyle w:val="Heading2"/>
       </w:pPr>
       <w:r>
-        <w:t xml:space="preserve">Best practices for publishing station based observational data</w:t>
+        <w:t xml:space="preserve">WIS2 Node Assessment Process</w:t>
       </w:r>
     </w:p>
     <w:p>
@@ -1700,7 +1700,84 @@
         <w:pStyle w:val="FirstParagraph"/>
       </w:pPr>
       <w:r>
-        <w:t xml:space="preserve">The WMO Unified Data Policy defines the following data types:</w:t>
+        <w:t xml:space="preserve">Data publishers are required to demonstrate that their WIS2 Node implementation meets the requirements of the WIS2 specification as part of the "WIS2 Node Assessment Process".</w:t>
+      </w:r>
+    </w:p>
+    <w:p>
+      <w:pPr>
+        <w:pStyle w:val="BodyText"/>
+      </w:pPr>
+      <w:r>
+        <w:t xml:space="preserve">The WIS2 Node Assessment Process is initiated whenever an authorized data publisher submits a WIS2 Node registration request to the WMO Secretariat.</w:t>
+      </w:r>
+    </w:p>
+    <w:p>
+      <w:pPr>
+        <w:pStyle w:val="BodyText"/>
+      </w:pPr>
+      <w:r>
+        <w:t xml:space="preserve">Global Information System Centres (GISCs) are responsible for assessing WIS2 Node implementations in their Area of Responsibility (AoR) and providing feedback to the WMO Secretariat.</w:t>
+      </w:r>
+    </w:p>
+    <w:p>
+      <w:pPr>
+        <w:pStyle w:val="BodyText"/>
+      </w:pPr>
+      <w:r>
+        <w:t xml:space="preserve">For an overview GISCs and their AoRs, see</w:t>
+      </w:r>
+      <w:r>
+        <w:t xml:space="preserve"> </w:t>
+      </w:r>
+      <w:hyperlink r:id="rId45">
+        <w:r>
+          <w:rPr>
+            <w:rStyle w:val="Hyperlink"/>
+          </w:rPr>
+          <w:t xml:space="preserve">WMO: WIS centres (NCs, DCPCs, and GISCs)</w:t>
+        </w:r>
+      </w:hyperlink>
+      <w:r>
+        <w:t xml:space="preserve"> </w:t>
+      </w:r>
+      <w:r>
+        <w:t xml:space="preserve">on the WMO Knowledge Hub.</w:t>
+      </w:r>
+    </w:p>
+    <w:bookmarkStart w:id="48" w:name="Xda8c6d204074370d1bc30d76c548d2f7edf5357"/>
+    <w:p>
+      <w:pPr>
+        <w:pStyle w:val="Heading3"/>
+      </w:pPr>
+      <w:r>
+        <w:t xml:space="preserve">Roles and Responsibilities</w:t>
+      </w:r>
+    </w:p>
+    <w:p>
+      <w:pPr>
+        <w:pStyle w:val="FirstParagraph"/>
+      </w:pPr>
+      <w:r>
+        <w:t xml:space="preserve">Prior to the WIS2 Node Assessment process, the WMO Secretariat will ensure the centre-id is published in the WMO Codes Registry at</w:t>
+      </w:r>
+      <w:r>
+        <w:t xml:space="preserve"> </w:t>
+      </w:r>
+      <w:hyperlink r:id="rId46">
+        <w:r>
+          <w:rPr>
+            <w:rStyle w:val="Hyperlink"/>
+          </w:rPr>
+          <w:t xml:space="preserve">http://codes.wmo.int/wis/topic-hierarchy/centre-id</w:t>
+        </w:r>
+      </w:hyperlink>
+    </w:p>
+    <w:p>
+      <w:pPr>
+        <w:pStyle w:val="BodyText"/>
+      </w:pPr>
+      <w:r>
+        <w:t xml:space="preserve">During the WIS2 Node assessment:</w:t>
       </w:r>
     </w:p>
     <w:p>
@@ -1711,7 +1788,7 @@
         </w:numPr>
       </w:pPr>
       <w:r>
-        <w:t xml:space="preserve">Core Weather Surface-based data: observations provided by the Global Basic Observing Network (GBON) and other observational data, as specified in the Manual on the WMO Integrated Global Observing System (WMO-No. 1160);</w:t>
+        <w:t xml:space="preserve">The WMO Secretariat connects the WIS2 Node to the WIS2 Development Environment (called wis2dev later).</w:t>
       </w:r>
     </w:p>
     <w:p>
@@ -1722,7 +1799,7 @@
         </w:numPr>
       </w:pPr>
       <w:r>
-        <w:t xml:space="preserve">Recommended Weather Surface-based data: all available observations provided by the Regional Basic Observing Network (RBON), which is further specified in the Manual on the WMO Integrated Global Observing System (WMO-No. 1160);</w:t>
+        <w:t xml:space="preserve">The GISC associated to the new WIS2 Node performs the assessment.</w:t>
       </w:r>
     </w:p>
     <w:p>
@@ -1733,6 +1810,1105 @@
         </w:numPr>
       </w:pPr>
       <w:r>
+        <w:t xml:space="preserve">The GISC informs WMO Secretariat when the assessment has been completed.</w:t>
+      </w:r>
+    </w:p>
+    <w:p>
+      <w:pPr>
+        <w:pStyle w:val="FirstParagraph"/>
+      </w:pPr>
+      <w:r>
+        <w:t xml:space="preserve">Optional pre-registration testing</w:t>
+      </w:r>
+    </w:p>
+    <w:p>
+      <w:pPr>
+        <w:pStyle w:val="BodyText"/>
+      </w:pPr>
+      <w:r>
+        <w:t xml:space="preserve">Data publishers or WIS2 solution providers who want to test their systems before registration can contact the WMO Secretariat at</w:t>
+      </w:r>
+      <w:r>
+        <w:t xml:space="preserve"> </w:t>
+      </w:r>
+      <w:hyperlink r:id="rId47">
+        <w:r>
+          <w:rPr>
+            <w:rStyle w:val="Hyperlink"/>
+          </w:rPr>
+          <w:t xml:space="preserve">wis2-support@wmo.int</w:t>
+        </w:r>
+      </w:hyperlink>
+      <w:r>
+        <w:t xml:space="preserve"> </w:t>
+      </w:r>
+      <w:r>
+        <w:t xml:space="preserve">to request that a test system be connected to wis2dev.</w:t>
+      </w:r>
+    </w:p>
+    <w:bookmarkEnd w:id="48"/>
+    <w:bookmarkStart w:id="49" w:name="Xdbe974ac6b73570932945346ec1ebb50fdb48ae"/>
+    <w:p>
+      <w:pPr>
+        <w:pStyle w:val="Heading3"/>
+      </w:pPr>
+      <w:r>
+        <w:t xml:space="preserve">WIS2 Development Environment</w:t>
+      </w:r>
+    </w:p>
+    <w:p>
+      <w:pPr>
+        <w:pStyle w:val="FirstParagraph"/>
+      </w:pPr>
+      <w:r>
+        <w:t xml:space="preserve">The WIS2 Development Environment (wis2dev) consists of:</w:t>
+      </w:r>
+    </w:p>
+    <w:p>
+      <w:pPr>
+        <w:numPr>
+          <w:ilvl w:val="0"/>
+          <w:numId w:val="1010"/>
+        </w:numPr>
+      </w:pPr>
+      <w:r>
+        <w:t xml:space="preserve">A Global Broker (wis2dev GB) with a publicly accessible MQTT endpoint available at:</w:t>
+      </w:r>
+      <w:r>
+        <w:t xml:space="preserve"> </w:t>
+      </w:r>
+      <w:r>
+        <w:rPr>
+          <w:rStyle w:val="VerbatimChar"/>
+        </w:rPr>
+        <w:t xml:space="preserve">mqtts://gb.wis2dev.io:8883</w:t>
+      </w:r>
+    </w:p>
+    <w:p>
+      <w:pPr>
+        <w:numPr>
+          <w:ilvl w:val="0"/>
+          <w:numId w:val="1010"/>
+        </w:numPr>
+      </w:pPr>
+      <w:r>
+        <w:t xml:space="preserve">A Global Discovery Catalogue (wis2dev GDC) with an OGC API - Records endpoint available at:</w:t>
+      </w:r>
+      <w:r>
+        <w:t xml:space="preserve"> </w:t>
+      </w:r>
+      <w:r>
+        <w:rPr>
+          <w:rStyle w:val="VerbatimChar"/>
+        </w:rPr>
+        <w:t xml:space="preserve">https://gdc.wis2dev.io/</w:t>
+      </w:r>
+    </w:p>
+    <w:p>
+      <w:pPr>
+        <w:numPr>
+          <w:ilvl w:val="0"/>
+          <w:numId w:val="1010"/>
+        </w:numPr>
+      </w:pPr>
+      <w:r>
+        <w:t xml:space="preserve">A Global Cache (wis2dev GC) provided through Amazon S3 web services</w:t>
+      </w:r>
+    </w:p>
+    <w:bookmarkEnd w:id="49"/>
+    <w:bookmarkStart w:id="50" w:name="X7c225ec05a7af54354642cacee114b75e0f9597"/>
+    <w:p>
+      <w:pPr>
+        <w:pStyle w:val="Heading3"/>
+      </w:pPr>
+      <w:r>
+        <w:t xml:space="preserve">wis2dev GB</w:t>
+      </w:r>
+    </w:p>
+    <w:p>
+      <w:pPr>
+        <w:pStyle w:val="FirstParagraph"/>
+      </w:pPr>
+      <w:r>
+        <w:t xml:space="preserve">When a new WIS2 Node registration request is received from an authorized data publisher, the wis2dev GB is configured with a new subscription to the MQTT endpoint provided by the data publisher.</w:t>
+      </w:r>
+    </w:p>
+    <w:p>
+      <w:pPr>
+        <w:pStyle w:val="BodyText"/>
+      </w:pPr>
+      <w:r>
+        <w:t xml:space="preserve">The new subscription on the wis2dev GB will subscribe to the topic:</w:t>
+      </w:r>
+    </w:p>
+    <w:p>
+      <w:pPr>
+        <w:numPr>
+          <w:ilvl w:val="0"/>
+          <w:numId w:val="1011"/>
+        </w:numPr>
+      </w:pPr>
+      <w:r>
+        <w:rPr>
+          <w:rStyle w:val="VerbatimChar"/>
+        </w:rPr>
+        <w:t xml:space="preserve">origin/a/wis2/&lt;centre-id&gt;/#</w:t>
+      </w:r>
+    </w:p>
+    <w:p>
+      <w:pPr>
+        <w:pStyle w:val="FirstParagraph"/>
+      </w:pPr>
+      <w:r>
+        <w:t xml:space="preserve">where</w:t>
+      </w:r>
+      <w:r>
+        <w:t xml:space="preserve"> </w:t>
+      </w:r>
+      <w:r>
+        <w:rPr>
+          <w:rStyle w:val="VerbatimChar"/>
+        </w:rPr>
+        <w:t xml:space="preserve">&lt;centre-id&gt;</w:t>
+      </w:r>
+      <w:r>
+        <w:t xml:space="preserve"> </w:t>
+      </w:r>
+      <w:r>
+        <w:t xml:space="preserve">is the unique identifier of the WIS2 Node.</w:t>
+      </w:r>
+    </w:p>
+    <w:p>
+      <w:pPr>
+        <w:pStyle w:val="BodyText"/>
+      </w:pPr>
+      <w:r>
+        <w:t xml:space="preserve">The wis2dev GB republishes all valid WIS2 Notification Messages. A message is considered invalid when:</w:t>
+      </w:r>
+    </w:p>
+    <w:p>
+      <w:pPr>
+        <w:numPr>
+          <w:ilvl w:val="0"/>
+          <w:numId w:val="1012"/>
+        </w:numPr>
+      </w:pPr>
+      <w:r>
+        <w:t xml:space="preserve">the topic used when publishing the Notification Message does not match any approved topic in the WIS2 Topic Hierarchy, or</w:t>
+      </w:r>
+    </w:p>
+    <w:p>
+      <w:pPr>
+        <w:numPr>
+          <w:ilvl w:val="0"/>
+          <w:numId w:val="1012"/>
+        </w:numPr>
+      </w:pPr>
+      <w:r>
+        <w:t xml:space="preserve">the message does not conform to the WIS2 Notification Message specification, or</w:t>
+      </w:r>
+    </w:p>
+    <w:p>
+      <w:pPr>
+        <w:numPr>
+          <w:ilvl w:val="0"/>
+          <w:numId w:val="1012"/>
+        </w:numPr>
+      </w:pPr>
+      <w:r>
+        <w:t xml:space="preserve">the message is a data notification for which no corresponding discovery metadata record can be found in the wis2dev GDC.</w:t>
+      </w:r>
+    </w:p>
+    <w:bookmarkEnd w:id="50"/>
+    <w:bookmarkStart w:id="51" w:name="Xb7a9f0a2b2dceec975f06e38eba6556347b4976"/>
+    <w:p>
+      <w:pPr>
+        <w:pStyle w:val="Heading3"/>
+      </w:pPr>
+      <w:r>
+        <w:t xml:space="preserve">wis2dev GC</w:t>
+      </w:r>
+    </w:p>
+    <w:p>
+      <w:pPr>
+        <w:pStyle w:val="FirstParagraph"/>
+      </w:pPr>
+      <w:r>
+        <w:t xml:space="preserve">The wis2dev Global Cache downloads data advertised in data notifications published on:</w:t>
+      </w:r>
+    </w:p>
+    <w:p>
+      <w:pPr>
+        <w:numPr>
+          <w:ilvl w:val="0"/>
+          <w:numId w:val="1013"/>
+        </w:numPr>
+      </w:pPr>
+      <w:r>
+        <w:rPr>
+          <w:rStyle w:val="VerbatimChar"/>
+        </w:rPr>
+        <w:t xml:space="preserve">origin/a/wis2/&lt;centre-id&gt;/data/core/#</w:t>
+      </w:r>
+    </w:p>
+    <w:p>
+      <w:pPr>
+        <w:numPr>
+          <w:ilvl w:val="0"/>
+          <w:numId w:val="1013"/>
+        </w:numPr>
+      </w:pPr>
+      <w:r>
+        <w:rPr>
+          <w:rStyle w:val="VerbatimChar"/>
+        </w:rPr>
+        <w:t xml:space="preserve">origin/a/wis2/&lt;centre-id&gt;/metadata/#</w:t>
+      </w:r>
+    </w:p>
+    <w:p>
+      <w:pPr>
+        <w:pStyle w:val="FirstParagraph"/>
+      </w:pPr>
+      <w:r>
+        <w:t xml:space="preserve">No download attempt is made if the data has already been downloaded, unless the download link indicates</w:t>
+      </w:r>
+      <w:r>
+        <w:t xml:space="preserve"> </w:t>
+      </w:r>
+      <w:r>
+        <w:rPr>
+          <w:rStyle w:val="VerbatimChar"/>
+        </w:rPr>
+        <w:t xml:space="preserve">rel="update"</w:t>
+      </w:r>
+      <w:r>
+        <w:t xml:space="preserve">.</w:t>
+      </w:r>
+    </w:p>
+    <w:p>
+      <w:pPr>
+        <w:pStyle w:val="BodyText"/>
+      </w:pPr>
+      <w:r>
+        <w:t xml:space="preserve">After a successful download, the wis2dev GC publishes a data notification on</w:t>
+      </w:r>
+      <w:r>
+        <w:t xml:space="preserve"> </w:t>
+      </w:r>
+      <w:r>
+        <w:rPr>
+          <w:rStyle w:val="VerbatimChar"/>
+        </w:rPr>
+        <w:t xml:space="preserve">cache/a/wis2/&lt;centre-id&gt;/#</w:t>
+      </w:r>
+      <w:r>
+        <w:t xml:space="preserve">, with the full topic matching that of the original WIS2 Node, but with</w:t>
+      </w:r>
+      <w:r>
+        <w:t xml:space="preserve"> </w:t>
+      </w:r>
+      <w:r>
+        <w:rPr>
+          <w:rStyle w:val="VerbatimChar"/>
+        </w:rPr>
+        <w:t xml:space="preserve">origin</w:t>
+      </w:r>
+      <w:r>
+        <w:t xml:space="preserve"> </w:t>
+      </w:r>
+      <w:r>
+        <w:t xml:space="preserve">replaced by</w:t>
+      </w:r>
+      <w:r>
+        <w:t xml:space="preserve"> </w:t>
+      </w:r>
+      <w:r>
+        <w:rPr>
+          <w:rStyle w:val="VerbatimChar"/>
+        </w:rPr>
+        <w:t xml:space="preserve">cache</w:t>
+      </w:r>
+      <w:r>
+        <w:t xml:space="preserve">.</w:t>
+      </w:r>
+    </w:p>
+    <w:p>
+      <w:pPr>
+        <w:pStyle w:val="BodyText"/>
+      </w:pPr>
+      <w:r>
+        <w:t xml:space="preserve">Notifications published by the wis2dev GC on</w:t>
+      </w:r>
+      <w:r>
+        <w:t xml:space="preserve"> </w:t>
+      </w:r>
+      <w:r>
+        <w:rPr>
+          <w:rStyle w:val="VerbatimChar"/>
+        </w:rPr>
+        <w:t xml:space="preserve">cache/a/wis2/#</w:t>
+      </w:r>
+      <w:r>
+        <w:t xml:space="preserve"> </w:t>
+      </w:r>
+      <w:r>
+        <w:t xml:space="preserve">are republished by the wis2dev GB.</w:t>
+      </w:r>
+    </w:p>
+    <w:bookmarkEnd w:id="51"/>
+    <w:bookmarkStart w:id="52" w:name="Xfda30f882e574c1e7de0135665f6899968f6f89"/>
+    <w:p>
+      <w:pPr>
+        <w:pStyle w:val="Heading3"/>
+      </w:pPr>
+      <w:r>
+        <w:t xml:space="preserve">wis2dev GDC</w:t>
+      </w:r>
+    </w:p>
+    <w:p>
+      <w:pPr>
+        <w:pStyle w:val="FirstParagraph"/>
+      </w:pPr>
+      <w:r>
+        <w:t xml:space="preserve">The wis2dev Global Discovery Catalogue subscribes to the wis2dev GB at</w:t>
+      </w:r>
+      <w:r>
+        <w:t xml:space="preserve"> </w:t>
+      </w:r>
+      <w:r>
+        <w:rPr>
+          <w:rStyle w:val="VerbatimChar"/>
+        </w:rPr>
+        <w:t xml:space="preserve">cache/a/wis2/&lt;centre-id&gt;/metadata</w:t>
+      </w:r>
+      <w:r>
+        <w:t xml:space="preserve"> </w:t>
+      </w:r>
+      <w:r>
+        <w:t xml:space="preserve">and validates discovery metadata records published by the WIS2 Node using the pywcmp validation and quality assessment tool.</w:t>
+      </w:r>
+    </w:p>
+    <w:bookmarkEnd w:id="52"/>
+    <w:bookmarkStart w:id="53" w:name="X1444b248c8257d2ee5813a7cfabcc0940cd96d5"/>
+    <w:p>
+      <w:pPr>
+        <w:pStyle w:val="Heading3"/>
+      </w:pPr>
+      <w:r>
+        <w:t xml:space="preserve">Assessment Preparation for Data Publishers</w:t>
+      </w:r>
+    </w:p>
+    <w:p>
+      <w:pPr>
+        <w:pStyle w:val="FirstParagraph"/>
+      </w:pPr>
+      <w:r>
+        <w:t xml:space="preserve">Before the assessment, data publishers should ensure that:</w:t>
+      </w:r>
+    </w:p>
+    <w:p>
+      <w:pPr>
+        <w:numPr>
+          <w:ilvl w:val="0"/>
+          <w:numId w:val="1014"/>
+        </w:numPr>
+      </w:pPr>
+      <w:r>
+        <w:t xml:space="preserve">The wis2dev IP address,</w:t>
+      </w:r>
+      <w:r>
+        <w:t xml:space="preserve"> </w:t>
+      </w:r>
+      <w:r>
+        <w:rPr>
+          <w:rStyle w:val="VerbatimChar"/>
+        </w:rPr>
+        <w:t xml:space="preserve">52.25.203.140</w:t>
+      </w:r>
+      <w:r>
+        <w:t xml:space="preserve">, is allowlisted for the HTTP and MQTT ports used by the WIS2 Node.</w:t>
+      </w:r>
+    </w:p>
+    <w:p>
+      <w:pPr>
+        <w:numPr>
+          <w:ilvl w:val="0"/>
+          <w:numId w:val="1014"/>
+        </w:numPr>
+      </w:pPr>
+      <w:r>
+        <w:t xml:space="preserve">The WIS2 Node can publish data notifications for metadata, and the published metadata contains a valid WCMP2 record.</w:t>
+      </w:r>
+    </w:p>
+    <w:p>
+      <w:pPr>
+        <w:numPr>
+          <w:ilvl w:val="0"/>
+          <w:numId w:val="1014"/>
+        </w:numPr>
+      </w:pPr>
+      <w:r>
+        <w:t xml:space="preserve">The WIS2 Node can publish data notifications for data, and the data notifications match the published metadata.</w:t>
+      </w:r>
+    </w:p>
+    <w:bookmarkEnd w:id="53"/>
+    <w:bookmarkEnd w:id="54"/>
+    <w:bookmarkStart w:id="58" w:name="X5353346def5e1367137e12a323ec8f992cf64b7"/>
+    <w:p>
+      <w:pPr>
+        <w:pStyle w:val="Heading2"/>
+      </w:pPr>
+      <w:r>
+        <w:t xml:space="preserve">GISC test setup instructions</w:t>
+      </w:r>
+    </w:p>
+    <w:p>
+      <w:pPr>
+        <w:pStyle w:val="FirstParagraph"/>
+      </w:pPr>
+      <w:r>
+        <w:t xml:space="preserve">GISCs subscribe to</w:t>
+      </w:r>
+      <w:r>
+        <w:t xml:space="preserve"> </w:t>
+      </w:r>
+      <w:r>
+        <w:rPr>
+          <w:rStyle w:val="VerbatimChar"/>
+        </w:rPr>
+        <w:t xml:space="preserve">mqtts://gb.wis2dev.io:8883</w:t>
+      </w:r>
+      <w:r>
+        <w:t xml:space="preserve"> </w:t>
+      </w:r>
+      <w:r>
+        <w:t xml:space="preserve">using username/password</w:t>
+      </w:r>
+      <w:r>
+        <w:t xml:space="preserve"> </w:t>
+      </w:r>
+      <w:r>
+        <w:rPr>
+          <w:rStyle w:val="VerbatimChar"/>
+        </w:rPr>
+        <w:t xml:space="preserve">everyone/everyone</w:t>
+      </w:r>
+      <w:r>
+        <w:t xml:space="preserve"> </w:t>
+      </w:r>
+      <w:r>
+        <w:t xml:space="preserve">and set up a connection to the topics:</w:t>
+      </w:r>
+    </w:p>
+    <w:p>
+      <w:pPr>
+        <w:numPr>
+          <w:ilvl w:val="0"/>
+          <w:numId w:val="1015"/>
+        </w:numPr>
+      </w:pPr>
+      <w:r>
+        <w:rPr>
+          <w:rStyle w:val="VerbatimChar"/>
+        </w:rPr>
+        <w:t xml:space="preserve">origin/a/wis2/&lt;centre-id&gt;/#</w:t>
+      </w:r>
+    </w:p>
+    <w:p>
+      <w:pPr>
+        <w:numPr>
+          <w:ilvl w:val="0"/>
+          <w:numId w:val="1015"/>
+        </w:numPr>
+      </w:pPr>
+      <w:r>
+        <w:rPr>
+          <w:rStyle w:val="VerbatimChar"/>
+        </w:rPr>
+        <w:t xml:space="preserve">cache/a/wis2/&lt;centre-id&gt;/#</w:t>
+      </w:r>
+    </w:p>
+    <w:p>
+      <w:pPr>
+        <w:numPr>
+          <w:ilvl w:val="0"/>
+          <w:numId w:val="1015"/>
+        </w:numPr>
+      </w:pPr>
+      <w:r>
+        <w:rPr>
+          <w:rStyle w:val="VerbatimChar"/>
+        </w:rPr>
+        <w:t xml:space="preserve">monitor/a/wis2/&lt;centre-id&gt;</w:t>
+      </w:r>
+    </w:p>
+    <w:p>
+      <w:pPr>
+        <w:pStyle w:val="FirstParagraph"/>
+      </w:pPr>
+      <w:r>
+        <w:t xml:space="preserve">GISCs will coordinate with the contact point for the new WIS2 Node to first publish discovery metadata for their datasets and then to publish data notifications.</w:t>
+      </w:r>
+    </w:p>
+    <w:p>
+      <w:pPr>
+        <w:pStyle w:val="BodyText"/>
+      </w:pPr>
+      <w:r>
+        <w:t xml:space="preserve">Approximately 30 minutes are needed after metadata is published before the Global Broker can validate that published data has corresponding metadata.</w:t>
+      </w:r>
+    </w:p>
+    <w:p>
+      <w:pPr>
+        <w:pStyle w:val="BodyText"/>
+      </w:pPr>
+      <w:r>
+        <w:t xml:space="preserve">GISCs will follow up on errors reported on the monitor topic (</w:t>
+      </w:r>
+      <w:r>
+        <w:rPr>
+          <w:rStyle w:val="VerbatimChar"/>
+        </w:rPr>
+        <w:t xml:space="preserve">monitor/a/wis2/#</w:t>
+      </w:r>
+      <w:r>
+        <w:t xml:space="preserve">) and assist the contact point of the new WIS2 Node with corrective actions.</w:t>
+      </w:r>
+    </w:p>
+    <w:bookmarkStart w:id="55" w:name="Xcf9e5a103cdef37f9ba4d9832779ec978dd3e6f"/>
+    <w:p>
+      <w:pPr>
+        <w:pStyle w:val="Heading3"/>
+      </w:pPr>
+      <w:r>
+        <w:t xml:space="preserve">Assessment Completion Checklist</w:t>
+      </w:r>
+    </w:p>
+    <w:p>
+      <w:pPr>
+        <w:pStyle w:val="FirstParagraph"/>
+      </w:pPr>
+      <w:r>
+        <w:t xml:space="preserve">The WIS2 Node Assessment is considered complete when:</w:t>
+      </w:r>
+    </w:p>
+    <w:p>
+      <w:pPr>
+        <w:numPr>
+          <w:ilvl w:val="0"/>
+          <w:numId w:val="1016"/>
+        </w:numPr>
+      </w:pPr>
+      <w:r>
+        <w:t xml:space="preserve">One or more metadata records are available for the WIS2 Node when searching</w:t>
+      </w:r>
+      <w:r>
+        <w:t xml:space="preserve"> </w:t>
+      </w:r>
+      <w:r>
+        <w:rPr>
+          <w:rStyle w:val="VerbatimChar"/>
+        </w:rPr>
+        <w:t xml:space="preserve">https://gdc.wis2dev.io/collections/wis2-discovery-metadata/items?q=%3Ccentre-id%3E</w:t>
+      </w:r>
+    </w:p>
+    <w:p>
+      <w:pPr>
+        <w:numPr>
+          <w:ilvl w:val="0"/>
+          <w:numId w:val="1016"/>
+        </w:numPr>
+      </w:pPr>
+      <w:r>
+        <w:t xml:space="preserve">MQTT notifications seen on wis2dev GB at</w:t>
+      </w:r>
+      <w:r>
+        <w:t xml:space="preserve"> </w:t>
+      </w:r>
+      <w:r>
+        <w:rPr>
+          <w:rStyle w:val="VerbatimChar"/>
+        </w:rPr>
+        <w:t xml:space="preserve">origin/a/wis2/&lt;centre-id&gt;/metadata</w:t>
+      </w:r>
+    </w:p>
+    <w:p>
+      <w:pPr>
+        <w:numPr>
+          <w:ilvl w:val="0"/>
+          <w:numId w:val="1016"/>
+        </w:numPr>
+      </w:pPr>
+      <w:r>
+        <w:t xml:space="preserve">MQTT notifications seen on wis2dev GB at</w:t>
+      </w:r>
+      <w:r>
+        <w:t xml:space="preserve"> </w:t>
+      </w:r>
+      <w:r>
+        <w:rPr>
+          <w:rStyle w:val="VerbatimChar"/>
+        </w:rPr>
+        <w:t xml:space="preserve">origin/a/wis2/&lt;centre-id&gt;/data/#</w:t>
+      </w:r>
+    </w:p>
+    <w:p>
+      <w:pPr>
+        <w:numPr>
+          <w:ilvl w:val="0"/>
+          <w:numId w:val="1016"/>
+        </w:numPr>
+      </w:pPr>
+      <w:r>
+        <w:t xml:space="preserve">MQTT notifications seen on wis2dev GB at</w:t>
+      </w:r>
+      <w:r>
+        <w:t xml:space="preserve"> </w:t>
+      </w:r>
+      <w:r>
+        <w:rPr>
+          <w:rStyle w:val="VerbatimChar"/>
+        </w:rPr>
+        <w:t xml:space="preserve">cache/a/wis2/&lt;centre-id&gt;/metadata</w:t>
+      </w:r>
+    </w:p>
+    <w:p>
+      <w:pPr>
+        <w:numPr>
+          <w:ilvl w:val="0"/>
+          <w:numId w:val="1016"/>
+        </w:numPr>
+      </w:pPr>
+      <w:r>
+        <w:t xml:space="preserve">MQTT notifications seen on wis2dev GB at</w:t>
+      </w:r>
+      <w:r>
+        <w:t xml:space="preserve"> </w:t>
+      </w:r>
+      <w:r>
+        <w:rPr>
+          <w:rStyle w:val="VerbatimChar"/>
+        </w:rPr>
+        <w:t xml:space="preserve">cache/a/wis2/&lt;centre-id&gt;/data/core/#</w:t>
+      </w:r>
+    </w:p>
+    <w:bookmarkEnd w:id="55"/>
+    <w:bookmarkStart w:id="57" w:name="X599a2ee295bea0cc25fb04dd96000c9c6e6782e"/>
+    <w:p>
+      <w:pPr>
+        <w:pStyle w:val="Heading3"/>
+      </w:pPr>
+      <w:r>
+        <w:t xml:space="preserve">Common Assessment Issues</w:t>
+      </w:r>
+    </w:p>
+    <w:tbl>
+      <w:tblPr>
+        <w:tblStyle w:val="Table"/>
+        <w:tblW w:type="pct" w:w="5000"/>
+        <w:tblLook w:firstRow="1" w:lastRow="0" w:firstColumn="0" w:lastColumn="0" w:noHBand="0" w:noVBand="0" w:val="0020"/>
+        <w:jc w:val="start"/>
+      </w:tblPr>
+      <w:tblGrid>
+        <w:gridCol w:w="3168"/>
+        <w:gridCol w:w="4752"/>
+      </w:tblGrid>
+      <w:tr>
+        <w:trPr>
+          <w:tblHeader w:val="true"/>
+        </w:trPr>
+        <w:tc>
+          <w:tcPr/>
+          <w:p>
+            <w:pPr>
+              <w:pStyle w:val="Compact"/>
+              <w:jc w:val="left"/>
+            </w:pPr>
+            <w:r>
+              <w:t xml:space="preserve">Issue</w:t>
+            </w:r>
+          </w:p>
+        </w:tc>
+        <w:tc>
+          <w:tcPr/>
+          <w:p>
+            <w:pPr>
+              <w:pStyle w:val="Compact"/>
+              <w:jc w:val="left"/>
+            </w:pPr>
+            <w:r>
+              <w:t xml:space="preserve">Recommended action</w:t>
+            </w:r>
+          </w:p>
+        </w:tc>
+      </w:tr>
+      <w:tr>
+        <w:tc>
+          <w:tcPr/>
+          <w:p>
+            <w:pPr>
+              <w:jc w:val="left"/>
+            </w:pPr>
+            <w:r>
+              <w:t xml:space="preserve">Notifications published under</w:t>
+            </w:r>
+            <w:r>
+              <w:t xml:space="preserve"> </w:t>
+            </w:r>
+            <w:r>
+              <w:rPr>
+                <w:rStyle w:val="VerbatimChar"/>
+              </w:rPr>
+              <w:t xml:space="preserve">origin/a/wis2/&lt;centre-id&gt;</w:t>
+            </w:r>
+            <w:r>
+              <w:t xml:space="preserve"> </w:t>
+            </w:r>
+            <w:r>
+              <w:t xml:space="preserve">by the WIS2 Node are not being republished by the wis2dev GB.</w:t>
+            </w:r>
+          </w:p>
+        </w:tc>
+        <w:tc>
+          <w:tcPr/>
+          <w:p>
+            <w:pPr>
+              <w:jc w:val="left"/>
+            </w:pPr>
+            <w:r>
+              <w:t xml:space="preserve">The wis2dev GB will only republish notifications adhering to WIS2 standards. Messages reusing a previously used 'id' will be discarded as duplicates. Ensure that you use a valid WIS2 topic for the MQTT channel, that the payload adheres to the WIS2 Notification Message standard, and that a unique id is used for each notification.</w:t>
+            </w:r>
+          </w:p>
+        </w:tc>
+      </w:tr>
+      <w:tr>
+        <w:tc>
+          <w:tcPr/>
+          <w:p>
+            <w:pPr>
+              <w:jc w:val="left"/>
+            </w:pPr>
+            <w:r>
+              <w:t xml:space="preserve">Canonical URL embedded in a WIS2 data-notification is not accessible from wis2dev</w:t>
+            </w:r>
+          </w:p>
+        </w:tc>
+        <w:tc>
+          <w:tcPr/>
+          <w:p>
+            <w:pPr>
+              <w:jc w:val="left"/>
+            </w:pPr>
+            <w:r>
+              <w:t xml:space="preserve">Ensure that the canonical URL is reachable from the wis2dev environment over the public Internet. Check that the DNS resolves to the correct IP address and that the wis2dev incoming IP address,</w:t>
+            </w:r>
+            <w:r>
+              <w:t xml:space="preserve"> </w:t>
+            </w:r>
+            <w:r>
+              <w:rPr>
+                <w:rStyle w:val="VerbatimChar"/>
+              </w:rPr>
+              <w:t xml:space="preserve">52.25.203.140</w:t>
+            </w:r>
+            <w:r>
+              <w:t xml:space="preserve">, is allowed to access the WIS2 Node for MQTT(S) / WS(S) and HTTP(S).</w:t>
+            </w:r>
+          </w:p>
+        </w:tc>
+      </w:tr>
+      <w:tr>
+        <w:tc>
+          <w:tcPr/>
+          <w:p>
+            <w:pPr>
+              <w:jc w:val="left"/>
+            </w:pPr>
+            <w:r>
+              <w:t xml:space="preserve">WIS2 Node is not publishing data notifications for metadata</w:t>
+            </w:r>
+          </w:p>
+        </w:tc>
+        <w:tc>
+          <w:tcPr/>
+          <w:p>
+            <w:pPr>
+              <w:jc w:val="left"/>
+            </w:pPr>
+            <w:r>
+              <w:t xml:space="preserve">Ensure that data notifications for metadata are being published every 24 hours on the topic</w:t>
+            </w:r>
+            <w:r>
+              <w:t xml:space="preserve"> </w:t>
+            </w:r>
+            <w:r>
+              <w:rPr>
+                <w:rStyle w:val="VerbatimChar"/>
+              </w:rPr>
+              <w:t xml:space="preserve">origin/a/wis2/&lt;centre-id&gt;/metadata</w:t>
+            </w:r>
+            <w:r>
+              <w:t xml:space="preserve"> </w:t>
+            </w:r>
+            <w:r>
+              <w:t xml:space="preserve">and that the notification contains a valid WCMP2 record in the data payload.</w:t>
+            </w:r>
+          </w:p>
+        </w:tc>
+      </w:tr>
+      <w:tr>
+        <w:tc>
+          <w:tcPr/>
+          <w:p>
+            <w:pPr>
+              <w:jc w:val="left"/>
+            </w:pPr>
+            <w:r>
+              <w:t xml:space="preserve">Publishing a metadata-notification results in a notification on</w:t>
+            </w:r>
+            <w:r>
+              <w:t xml:space="preserve"> </w:t>
+            </w:r>
+            <w:r>
+              <w:rPr>
+                <w:rStyle w:val="VerbatimChar"/>
+              </w:rPr>
+              <w:t xml:space="preserve">origin/a/wis2/&lt;centre-id&gt;/metadata</w:t>
+            </w:r>
+            <w:r>
+              <w:t xml:space="preserve"> </w:t>
+            </w:r>
+            <w:r>
+              <w:t xml:space="preserve">but does not result in a notification on</w:t>
+            </w:r>
+            <w:r>
+              <w:t xml:space="preserve"> </w:t>
+            </w:r>
+            <w:r>
+              <w:rPr>
+                <w:rStyle w:val="VerbatimChar"/>
+              </w:rPr>
+              <w:t xml:space="preserve">cache/a/wis2/&lt;centre-id&gt;/metadata</w:t>
+            </w:r>
+            <w:r>
+              <w:t xml:space="preserve"> </w:t>
+            </w:r>
+            <w:r>
+              <w:t xml:space="preserve">on the wis2dev GB</w:t>
+            </w:r>
+          </w:p>
+        </w:tc>
+        <w:tc>
+          <w:tcPr/>
+          <w:p>
+            <w:pPr>
+              <w:jc w:val="left"/>
+            </w:pPr>
+            <w:r>
+              <w:t xml:space="preserve">Updated metadata records are rejected by the wis2dev GC if a previous record with the same data-id was already cached and the download link did not indicate rel="update". Ensure that the download link for updated metadata records indicates rel="update" or the Notification Message is using a new value for</w:t>
+            </w:r>
+            <w:r>
+              <w:t xml:space="preserve"> </w:t>
+            </w:r>
+            <w:r>
+              <w:rPr>
+                <w:rStyle w:val="VerbatimChar"/>
+              </w:rPr>
+              <w:t xml:space="preserve">properties.data_id</w:t>
+            </w:r>
+            <w:r>
+              <w:t xml:space="preserve">.</w:t>
+            </w:r>
+          </w:p>
+        </w:tc>
+      </w:tr>
+      <w:tr>
+        <w:tc>
+          <w:tcPr/>
+          <w:p>
+            <w:pPr>
+              <w:jc w:val="left"/>
+            </w:pPr>
+            <w:r>
+              <w:t xml:space="preserve">Metadata records published by the WIS2 Node are cached by the wis2dev GC, but rejected by the wis2dev GDC</w:t>
+            </w:r>
+          </w:p>
+        </w:tc>
+        <w:tc>
+          <w:tcPr/>
+          <w:p>
+            <w:pPr>
+              <w:jc w:val="left"/>
+            </w:pPr>
+            <w:r>
+              <w:t xml:space="preserve">The wis2dev GDC will reject data that fails the pywcmp validation and quality assessment tool. Non-wis2box users should ensure that the metadata record passes the pywcmp ETS validation prior to publishing (see</w:t>
+            </w:r>
+            <w:r>
+              <w:t xml:space="preserve"> </w:t>
+            </w:r>
+            <w:hyperlink r:id="rId56">
+              <w:r>
+                <w:rPr>
+                  <w:rStyle w:val="Hyperlink"/>
+                </w:rPr>
+                <w:t xml:space="preserve">https://github.com/World-Meteorological-Organization/pywcmp</w:t>
+              </w:r>
+            </w:hyperlink>
+            <w:r>
+              <w:t xml:space="preserve">). Data publishers using wis2box should ensure they use the latest version of the wis2box software to ensure the latest version of pywcmp is used. Note that the wis2dev GDC provides pywcmp validation and quality assessment as an online service (see</w:t>
+            </w:r>
+            <w:r>
+              <w:t xml:space="preserve"> </w:t>
+            </w:r>
+            <w:hyperlink w:anchor="X995cd585ef30d7db82fa8cb8b475d4735b246d7">
+              <w:r>
+                <w:rPr>
+                  <w:rStyle w:val="Hyperlink"/>
+                </w:rPr>
+                <w:t xml:space="preserve">Validating a WMO Core Metadata Profile record</w:t>
+              </w:r>
+            </w:hyperlink>
+            <w:r>
+              <w:t xml:space="preserve">)</w:t>
+            </w:r>
+          </w:p>
+        </w:tc>
+      </w:tr>
+    </w:tbl>
+    <w:p>
+      <w:pPr>
+        <w:pStyle w:val="BodyText"/>
+      </w:pPr>
+      <w:r>
+        <w:t xml:space="preserve">Implementation note regarding wis2box and metadata management</w:t>
+      </w:r>
+    </w:p>
+    <w:p>
+      <w:pPr>
+        <w:pStyle w:val="BodyText"/>
+      </w:pPr>
+      <w:r>
+        <w:rPr>
+          <w:rStyle w:val="VerbatimChar"/>
+        </w:rPr>
+        <w:t xml:space="preserve">wis2box</w:t>
+      </w:r>
+      <w:r>
+        <w:t xml:space="preserve"> </w:t>
+      </w:r>
+      <w:r>
+        <w:t xml:space="preserve">reduces metadata-related issues by enforcing a "dataset-driven workflow".</w:t>
+      </w:r>
+    </w:p>
+    <w:p>
+      <w:pPr>
+        <w:numPr>
+          <w:ilvl w:val="0"/>
+          <w:numId w:val="1017"/>
+        </w:numPr>
+      </w:pPr>
+      <w:r>
+        <w:t xml:space="preserve">Before publishing any data notifications, a dataset must first be created</w:t>
+      </w:r>
+    </w:p>
+    <w:p>
+      <w:pPr>
+        <w:numPr>
+          <w:ilvl w:val="0"/>
+          <w:numId w:val="1017"/>
+        </w:numPr>
+      </w:pPr>
+      <w:r>
+        <w:t xml:space="preserve">To create a dataset, a minimum amount of information must be provided to create the WCMP2 record</w:t>
+      </w:r>
+    </w:p>
+    <w:p>
+      <w:pPr>
+        <w:numPr>
+          <w:ilvl w:val="0"/>
+          <w:numId w:val="1017"/>
+        </w:numPr>
+      </w:pPr>
+      <w:r>
+        <w:t xml:space="preserve">Before publishing the WCMP2 record, the content is always validated using pywcmp</w:t>
+      </w:r>
+    </w:p>
+    <w:p>
+      <w:pPr>
+        <w:numPr>
+          <w:ilvl w:val="0"/>
+          <w:numId w:val="1017"/>
+        </w:numPr>
+      </w:pPr>
+      <w:r>
+        <w:t xml:space="preserve">Data notifications are associated to metadata programmatically by querying a local copy of the published WCMP2 records</w:t>
+      </w:r>
+    </w:p>
+    <w:p>
+      <w:pPr>
+        <w:pStyle w:val="FirstParagraph"/>
+      </w:pPr>
+      <w:r>
+        <w:t xml:space="preserve">WIS2 Node implementations that use separate software for metadata and data notifications are more likely to encounter metadata related issues.</w:t>
+      </w:r>
+    </w:p>
+    <w:p>
+      <w:pPr>
+        <w:pStyle w:val="BodyText"/>
+      </w:pPr>
+      <w:r>
+        <w:t xml:space="preserve">To reduce these issues, follow a wis2box-like workflow: create the metadata record first, then publish data notifications based on the published metadata records for your WIS2 Node.</w:t>
+      </w:r>
+    </w:p>
+    <w:bookmarkEnd w:id="57"/>
+    <w:bookmarkEnd w:id="58"/>
+    <w:bookmarkStart w:id="61" w:name="X9ec1a7498bcfb36243b04077bc9f17c25c5b48a"/>
+    <w:p>
+      <w:pPr>
+        <w:pStyle w:val="Heading2"/>
+      </w:pPr>
+      <w:r>
+        <w:t xml:space="preserve">Best practices for publishing station based observational data</w:t>
+      </w:r>
+    </w:p>
+    <w:p>
+      <w:pPr>
+        <w:pStyle w:val="FirstParagraph"/>
+      </w:pPr>
+      <w:r>
+        <w:t xml:space="preserve">The WMO Unified Data Policy defines the following data types:</w:t>
+      </w:r>
+    </w:p>
+    <w:p>
+      <w:pPr>
+        <w:numPr>
+          <w:ilvl w:val="0"/>
+          <w:numId w:val="1018"/>
+        </w:numPr>
+      </w:pPr>
+      <w:r>
+        <w:t xml:space="preserve">Core Weather Surface-based data: observations provided by the Global Basic Observing Network (GBON) and other observational data, as specified in the Manual on the WMO Integrated Global Observing System (WMO-No. 1160);</w:t>
+      </w:r>
+    </w:p>
+    <w:p>
+      <w:pPr>
+        <w:numPr>
+          <w:ilvl w:val="0"/>
+          <w:numId w:val="1018"/>
+        </w:numPr>
+      </w:pPr>
+      <w:r>
+        <w:t xml:space="preserve">Recommended Weather Surface-based data: all available observations provided by the Regional Basic Observing Network (RBON), which is further specified in the Manual on the WMO Integrated Global Observing System (WMO-No. 1160);</w:t>
+      </w:r>
+    </w:p>
+    <w:p>
+      <w:pPr>
+        <w:numPr>
+          <w:ilvl w:val="0"/>
+          <w:numId w:val="1018"/>
+        </w:numPr>
+      </w:pPr>
+      <w:r>
         <w:t xml:space="preserve">Core Climate observational data</w:t>
       </w:r>
     </w:p>
@@ -1740,7 +2916,7 @@
       <w:pPr>
         <w:numPr>
           <w:ilvl w:val="1"/>
-          <w:numId w:val="1010"/>
+          <w:numId w:val="1019"/>
         </w:numPr>
       </w:pPr>
       <w:r>
@@ -1751,7 +2927,7 @@
       <w:pPr>
         <w:numPr>
           <w:ilvl w:val="1"/>
-          <w:numId w:val="1010"/>
+          <w:numId w:val="1019"/>
         </w:numPr>
       </w:pPr>
       <w:r>
@@ -1762,7 +2938,7 @@
       <w:pPr>
         <w:numPr>
           <w:ilvl w:val="1"/>
-          <w:numId w:val="1010"/>
+          <w:numId w:val="1019"/>
         </w:numPr>
       </w:pPr>
       <w:r>
@@ -1793,7 +2969,7 @@
         <w:t xml:space="preserve">As publishing data to WIS 2.0 requires the WIS 2.0 Notificiation Message (WNM), the following aspects should be included when publishing observational data.</w:t>
       </w:r>
     </w:p>
-    <w:bookmarkStart w:id="45" w:name="Xbad2348b222628778fc4c270aca1624dd0b6699"/>
+    <w:bookmarkStart w:id="59" w:name="Xbad2348b222628778fc4c270aca1624dd0b6699"/>
     <w:p>
       <w:pPr>
         <w:pStyle w:val="Heading3"/>
@@ -2048,8 +3224,8 @@
         <w:t xml:space="preserve">.</w:t>
       </w:r>
     </w:p>
-    <w:bookmarkEnd w:id="45"/>
-    <w:bookmarkStart w:id="46" w:name="X383b908eb5f053fde5c30ae6f1a61d5369f2c40"/>
+    <w:bookmarkEnd w:id="59"/>
+    <w:bookmarkStart w:id="60" w:name="X383b908eb5f053fde5c30ae6f1a61d5369f2c40"/>
     <w:p>
       <w:pPr>
         <w:pStyle w:val="Heading3"/>
@@ -2212,9 +3388,9 @@
         <w:t xml:space="preserve">.</w:t>
       </w:r>
     </w:p>
-    <w:bookmarkEnd w:id="46"/>
-    <w:bookmarkEnd w:id="47"/>
-    <w:bookmarkStart w:id="50" w:name="X3995dddd3876ba8cabf02e648b80726a53ec13f"/>
+    <w:bookmarkEnd w:id="60"/>
+    <w:bookmarkEnd w:id="61"/>
+    <w:bookmarkStart w:id="64" w:name="X3995dddd3876ba8cabf02e648b80726a53ec13f"/>
     <w:p>
       <w:pPr>
         <w:pStyle w:val="Heading2"/>
@@ -2826,7 +4002,7 @@
         <w:rPr>
           <w:rStyle w:val="FootnoteReference"/>
         </w:rPr>
-        <w:footnoteReference w:id="48"/>
+        <w:footnoteReference w:id="62"/>
       </w:r>
       <w:r>
         <w:t xml:space="preserve">.</w:t>
@@ -2902,8 +4078,8 @@
         <w:t xml:space="preserve">.</w:t>
       </w:r>
     </w:p>
-    <w:bookmarkEnd w:id="50"/>
-    <w:bookmarkStart w:id="63" w:name="X50c67cc63f84fb5dcea02533e0f75ad9c18b269"/>
+    <w:bookmarkEnd w:id="64"/>
+    <w:bookmarkStart w:id="77" w:name="X50c67cc63f84fb5dcea02533e0f75ad9c18b269"/>
     <w:p>
       <w:pPr>
         <w:pStyle w:val="Heading2"/>
@@ -2920,7 +4096,7 @@
         <w:t xml:space="preserve">WIS2 and WCMP2 have been designed to support both real-time and historical data. While real-time data publishing in WIS2 typically includes real-time data notifications, archive data may or may not require data notifications, depending on how often the dataset is disseminated and/or updated.</w:t>
       </w:r>
     </w:p>
-    <w:bookmarkStart w:id="51" w:name="Xb84caabf977c131dbfef2f4b4c4a1c01fbc4a3d"/>
+    <w:bookmarkStart w:id="65" w:name="Xb84caabf977c131dbfef2f4b4c4a1c01fbc4a3d"/>
     <w:p>
       <w:pPr>
         <w:pStyle w:val="Heading3"/>
@@ -3399,8 +4575,8 @@
         <w:t xml:space="preserve">}</w:t>
       </w:r>
     </w:p>
-    <w:bookmarkEnd w:id="51"/>
-    <w:bookmarkStart w:id="62" w:name="Xe6e52494fdde7e74dde5b4e4ccbc457381734d4"/>
+    <w:bookmarkEnd w:id="65"/>
+    <w:bookmarkStart w:id="76" w:name="Xe6e52494fdde7e74dde5b4e4ccbc457381734d4"/>
     <w:p>
       <w:pPr>
         <w:pStyle w:val="Heading3"/>
@@ -3417,7 +4593,7 @@
         <w:t xml:space="preserve">The way in which a historical archive is disseminated can result in a few different possibilities in WCMP2 and WIS2 data notifications.</w:t>
       </w:r>
     </w:p>
-    <w:bookmarkStart w:id="55" w:name="X8c3aebddf1353b8d2000f44cb46d2660f20f113"/>
+    <w:bookmarkStart w:id="69" w:name="X8c3aebddf1353b8d2000f44cb46d2660f20f113"/>
     <w:p>
       <w:pPr>
         <w:pStyle w:val="Heading4"/>
@@ -3452,10 +4628,10 @@
       <w:pPr>
         <w:numPr>
           <w:ilvl w:val="0"/>
-          <w:numId w:val="1011"/>
+          <w:numId w:val="1020"/>
         </w:numPr>
       </w:pPr>
-      <w:hyperlink r:id="rId52">
+      <w:hyperlink r:id="rId66">
         <w:r>
           <w:rPr>
             <w:rStyle w:val="Hyperlink"/>
@@ -3471,10 +4647,10 @@
       <w:pPr>
         <w:numPr>
           <w:ilvl w:val="0"/>
-          <w:numId w:val="1011"/>
+          <w:numId w:val="1020"/>
         </w:numPr>
       </w:pPr>
-      <w:hyperlink r:id="rId53">
+      <w:hyperlink r:id="rId67">
         <w:r>
           <w:rPr>
             <w:rStyle w:val="Hyperlink"/>
@@ -3496,7 +4672,7 @@
       <w:r>
         <w:t xml:space="preserve"> </w:t>
       </w:r>
-      <w:hyperlink r:id="rId54">
+      <w:hyperlink r:id="rId68">
         <w:r>
           <w:rPr>
             <w:rStyle w:val="Hyperlink"/>
@@ -3508,8 +4684,8 @@
         <w:t xml:space="preserve">).</w:t>
       </w:r>
     </w:p>
-    <w:bookmarkEnd w:id="55"/>
-    <w:bookmarkStart w:id="56" w:name="X93417dd349e35976632d6b3d7e9f7d339be7516"/>
+    <w:bookmarkEnd w:id="69"/>
+    <w:bookmarkStart w:id="70" w:name="X93417dd349e35976632d6b3d7e9f7d339be7516"/>
     <w:p>
       <w:pPr>
         <w:pStyle w:val="Heading4"/>
@@ -3981,8 +5157,8 @@
         <w:t xml:space="preserve">}</w:t>
       </w:r>
     </w:p>
-    <w:bookmarkEnd w:id="56"/>
-    <w:bookmarkStart w:id="57" w:name="X89a35c07b3e2f3e0a87449ba6c6cbccda9dcc77"/>
+    <w:bookmarkEnd w:id="70"/>
+    <w:bookmarkStart w:id="71" w:name="X89a35c07b3e2f3e0a87449ba6c6cbccda9dcc77"/>
     <w:p>
       <w:pPr>
         <w:pStyle w:val="Heading4"/>
@@ -4400,8 +5576,8 @@
         <w:t xml:space="preserve">}</w:t>
       </w:r>
     </w:p>
-    <w:bookmarkEnd w:id="57"/>
-    <w:bookmarkStart w:id="61" w:name="X239215ca541e15e02bf8126541090884bad8aa2"/>
+    <w:bookmarkEnd w:id="71"/>
+    <w:bookmarkStart w:id="75" w:name="X239215ca541e15e02bf8126541090884bad8aa2"/>
     <w:p>
       <w:pPr>
         <w:pStyle w:val="Heading4"/>
@@ -4422,7 +5598,7 @@
       <w:pPr>
         <w:numPr>
           <w:ilvl w:val="0"/>
-          <w:numId w:val="1012"/>
+          <w:numId w:val="1021"/>
         </w:numPr>
       </w:pPr>
       <w:r>
@@ -4431,7 +5607,7 @@
       <w:r>
         <w:t xml:space="preserve"> </w:t>
       </w:r>
-      <w:hyperlink r:id="rId58">
+      <w:hyperlink r:id="rId72">
         <w:r>
           <w:rPr>
             <w:rStyle w:val="Hyperlink"/>
@@ -4448,7 +5624,7 @@
       <w:r>
         <w:t xml:space="preserve"> </w:t>
       </w:r>
-      <w:hyperlink r:id="rId59">
+      <w:hyperlink r:id="rId73">
         <w:r>
           <w:rPr>
             <w:rStyle w:val="Hyperlink"/>
@@ -4465,7 +5641,7 @@
       <w:r>
         <w:t xml:space="preserve"> </w:t>
       </w:r>
-      <w:hyperlink r:id="rId60">
+      <w:hyperlink r:id="rId74">
         <w:r>
           <w:rPr>
             <w:rStyle w:val="Hyperlink"/>
@@ -4481,7 +5657,7 @@
       <w:pPr>
         <w:numPr>
           <w:ilvl w:val="0"/>
-          <w:numId w:val="1012"/>
+          <w:numId w:val="1021"/>
         </w:numPr>
       </w:pPr>
       <w:r>
@@ -4496,10 +5672,10 @@
         <w:t xml:space="preserve">Note that the above options are not exhaustive, and additional approaches may be implemented to meet data/metadata publishing requirements of WIS2.</w:t>
       </w:r>
     </w:p>
-    <w:bookmarkEnd w:id="61"/>
-    <w:bookmarkEnd w:id="62"/>
-    <w:bookmarkEnd w:id="63"/>
-    <w:bookmarkStart w:id="69" w:name="Xd044250c31067254aa12b027378a87e24a854a4"/>
+    <w:bookmarkEnd w:id="75"/>
+    <w:bookmarkEnd w:id="76"/>
+    <w:bookmarkEnd w:id="77"/>
+    <w:bookmarkStart w:id="83" w:name="Xd044250c31067254aa12b027378a87e24a854a4"/>
     <w:p>
       <w:pPr>
         <w:pStyle w:val="Heading2"/>
@@ -4530,7 +5706,7 @@
         <w:rPr>
           <w:rStyle w:val="FootnoteReference"/>
         </w:rPr>
-        <w:footnoteReference w:id="64"/>
+        <w:footnoteReference w:id="78"/>
       </w:r>
       <w:r>
         <w:t xml:space="preserve">.</w:t>
@@ -4772,7 +5948,7 @@
       <w:r>
         <w:t xml:space="preserve"> </w:t>
       </w:r>
-      <w:hyperlink r:id="rId66">
+      <w:hyperlink r:id="rId80">
         <w:r>
           <w:rPr>
             <w:rStyle w:val="Hyperlink"/>
@@ -4803,7 +5979,7 @@
         <w:rPr>
           <w:rStyle w:val="FootnoteReference"/>
         </w:rPr>
-        <w:footnoteReference w:id="67"/>
+        <w:footnoteReference w:id="81"/>
       </w:r>
       <w:r>
         <w:t xml:space="preserve">.</w:t>
@@ -4829,8 +6005,8 @@
         <w:t xml:space="preserve">object). For example, MQTT links can be removed, and any links which no longer provide the data can also be removed. If the data is retired and has alternative access mechanisms (email, web form), these links can be added to the record.</w:t>
       </w:r>
     </w:p>
-    <w:bookmarkEnd w:id="69"/>
-    <w:bookmarkStart w:id="71" w:name="Xaaa05db1be865e783823b6090e06e22ab4853bb"/>
+    <w:bookmarkEnd w:id="83"/>
+    <w:bookmarkStart w:id="85" w:name="Xaaa05db1be865e783823b6090e06e22ab4853bb"/>
     <w:p>
       <w:pPr>
         <w:pStyle w:val="Heading2"/>
@@ -5062,7 +6238,7 @@
       <w:r>
         <w:t xml:space="preserve"> </w:t>
       </w:r>
-      <w:hyperlink r:id="rId70">
+      <w:hyperlink r:id="rId84">
         <w:r>
           <w:rPr>
             <w:rStyle w:val="Hyperlink"/>
@@ -5074,8 +6250,8 @@
         <w:t xml:space="preserve">) is the signal for identifying data provenance by a user assessing and reviewing dataset history and lineage.</w:t>
       </w:r>
     </w:p>
-    <w:bookmarkEnd w:id="71"/>
-    <w:bookmarkStart w:id="74" w:name="Xdfdc81c059df549239314ada7497ba026430c3a"/>
+    <w:bookmarkEnd w:id="85"/>
+    <w:bookmarkStart w:id="88" w:name="Xdfdc81c059df549239314ada7497ba026430c3a"/>
     <w:p>
       <w:pPr>
         <w:pStyle w:val="Heading2"/>
@@ -5094,7 +6270,7 @@
       <w:r>
         <w:t xml:space="preserve"> </w:t>
       </w:r>
-      <w:hyperlink r:id="rId72">
+      <w:hyperlink r:id="rId86">
         <w:r>
           <w:rPr>
             <w:rStyle w:val="Hyperlink"/>
@@ -5514,7 +6690,7 @@
       <w:r>
         <w:t xml:space="preserve"> </w:t>
       </w:r>
-      <w:hyperlink r:id="rId70">
+      <w:hyperlink r:id="rId84">
         <w:r>
           <w:rPr>
             <w:rStyle w:val="Hyperlink"/>
@@ -5531,7 +6707,7 @@
       <w:r>
         <w:t xml:space="preserve"> </w:t>
       </w:r>
-      <w:hyperlink r:id="rId73">
+      <w:hyperlink r:id="rId87">
         <w:r>
           <w:rPr>
             <w:rStyle w:val="Hyperlink"/>
@@ -5543,8 +6719,8 @@
         <w:t xml:space="preserve">.</w:t>
       </w:r>
     </w:p>
-    <w:bookmarkEnd w:id="74"/>
-    <w:bookmarkStart w:id="76" w:name="X2791e82ff46825f35d2306f8ccd94c8505d556a"/>
+    <w:bookmarkEnd w:id="88"/>
+    <w:bookmarkStart w:id="90" w:name="X2791e82ff46825f35d2306f8ccd94c8505d556a"/>
     <w:p>
       <w:pPr>
         <w:pStyle w:val="Heading2"/>
@@ -5593,7 +6769,7 @@
       <w:r>
         <w:t xml:space="preserve"> </w:t>
       </w:r>
-      <w:hyperlink r:id="rId75">
+      <w:hyperlink r:id="rId89">
         <w:r>
           <w:rPr>
             <w:rStyle w:val="Hyperlink"/>
@@ -6368,7 +7544,7 @@
       <w:pPr>
         <w:numPr>
           <w:ilvl w:val="0"/>
-          <w:numId w:val="1013"/>
+          <w:numId w:val="1022"/>
         </w:numPr>
       </w:pPr>
       <w:r>
@@ -6421,7 +7597,7 @@
       <w:pPr>
         <w:numPr>
           <w:ilvl w:val="0"/>
-          <w:numId w:val="1013"/>
+          <w:numId w:val="1022"/>
         </w:numPr>
       </w:pPr>
       <w:r>
@@ -6447,7 +7623,7 @@
       <w:pPr>
         <w:numPr>
           <w:ilvl w:val="0"/>
-          <w:numId w:val="1013"/>
+          <w:numId w:val="1022"/>
         </w:numPr>
       </w:pPr>
       <w:r>
@@ -6479,8 +7655,8 @@
         <w:t xml:space="preserve">for more information).</w:t>
       </w:r>
     </w:p>
-    <w:bookmarkEnd w:id="76"/>
-    <w:bookmarkStart w:id="81" w:name="Xae10fd5810bad4f5339eed1e5b9e85e61e75190"/>
+    <w:bookmarkEnd w:id="90"/>
+    <w:bookmarkStart w:id="95" w:name="Xae10fd5810bad4f5339eed1e5b9e85e61e75190"/>
     <w:p>
       <w:pPr>
         <w:pStyle w:val="Heading2"/>
@@ -6499,7 +7675,7 @@
       <w:r>
         <w:t xml:space="preserve"> </w:t>
       </w:r>
-      <w:hyperlink r:id="rId77">
+      <w:hyperlink r:id="rId91">
         <w:r>
           <w:rPr>
             <w:rStyle w:val="Hyperlink"/>
@@ -6516,7 +7692,7 @@
       <w:r>
         <w:t xml:space="preserve"> </w:t>
       </w:r>
-      <w:hyperlink r:id="rId78">
+      <w:hyperlink r:id="rId92">
         <w:r>
           <w:rPr>
             <w:rStyle w:val="Hyperlink"/>
@@ -6541,7 +7717,7 @@
       <w:r>
         <w:t xml:space="preserve"> </w:t>
       </w:r>
-      <w:hyperlink r:id="rId79">
+      <w:hyperlink r:id="rId93">
         <w:r>
           <w:rPr>
             <w:rStyle w:val="Hyperlink"/>
@@ -6576,7 +7752,7 @@
       <w:pPr>
         <w:numPr>
           <w:ilvl w:val="0"/>
-          <w:numId w:val="1014"/>
+          <w:numId w:val="1023"/>
         </w:numPr>
       </w:pPr>
       <w:r>
@@ -6602,7 +7778,7 @@
       <w:pPr>
         <w:numPr>
           <w:ilvl w:val="0"/>
-          <w:numId w:val="1014"/>
+          <w:numId w:val="1023"/>
         </w:numPr>
       </w:pPr>
       <w:r>
@@ -6643,7 +7819,7 @@
       <w:pPr>
         <w:numPr>
           <w:ilvl w:val="0"/>
-          <w:numId w:val="1014"/>
+          <w:numId w:val="1023"/>
         </w:numPr>
       </w:pPr>
       <w:r>
@@ -6887,7 +8063,7 @@
       <w:r>
         <w:t xml:space="preserve"> </w:t>
       </w:r>
-      <w:hyperlink r:id="rId80">
+      <w:hyperlink r:id="rId94">
         <w:r>
           <w:rPr>
             <w:rStyle w:val="Hyperlink"/>
@@ -8033,8 +9209,8 @@
         <w:t xml:space="preserve">.</w:t>
       </w:r>
     </w:p>
-    <w:bookmarkEnd w:id="81"/>
-    <w:bookmarkStart w:id="82" w:name="X57163bfd8e88e3a3a7296aa35a4daf680fe64a6"/>
+    <w:bookmarkEnd w:id="95"/>
+    <w:bookmarkStart w:id="96" w:name="X57163bfd8e88e3a3a7296aa35a4daf680fe64a6"/>
     <w:p>
       <w:pPr>
         <w:pStyle w:val="Heading2"/>
@@ -8053,7 +9229,7 @@
       <w:r>
         <w:t xml:space="preserve"> </w:t>
       </w:r>
-      <w:hyperlink r:id="rId77">
+      <w:hyperlink r:id="rId91">
         <w:r>
           <w:rPr>
             <w:rStyle w:val="Hyperlink"/>
@@ -8070,7 +9246,7 @@
       <w:r>
         <w:t xml:space="preserve"> </w:t>
       </w:r>
-      <w:hyperlink r:id="rId79">
+      <w:hyperlink r:id="rId93">
         <w:r>
           <w:rPr>
             <w:rStyle w:val="Hyperlink"/>
@@ -9001,8 +10177,8 @@
         <w:t xml:space="preserve">}</w:t>
       </w:r>
     </w:p>
-    <w:bookmarkEnd w:id="82"/>
-    <w:bookmarkStart w:id="86" w:name="X0a2be29613e87a878f2284241cd2b46f0146544"/>
+    <w:bookmarkEnd w:id="96"/>
+    <w:bookmarkStart w:id="100" w:name="X0a2be29613e87a878f2284241cd2b46f0146544"/>
     <w:p>
       <w:pPr>
         <w:pStyle w:val="Heading2"/>
@@ -9035,7 +10211,7 @@
       <w:pPr>
         <w:numPr>
           <w:ilvl w:val="0"/>
-          <w:numId w:val="1015"/>
+          <w:numId w:val="1024"/>
         </w:numPr>
       </w:pPr>
       <w:r>
@@ -9046,7 +10222,7 @@
       <w:pPr>
         <w:numPr>
           <w:ilvl w:val="0"/>
-          <w:numId w:val="1015"/>
+          <w:numId w:val="1024"/>
         </w:numPr>
       </w:pPr>
       <w:r>
@@ -9340,7 +10516,7 @@
       <w:pPr>
         <w:numPr>
           <w:ilvl w:val="0"/>
-          <w:numId w:val="1016"/>
+          <w:numId w:val="1025"/>
         </w:numPr>
       </w:pPr>
       <w:r>
@@ -9351,7 +10527,7 @@
       <w:pPr>
         <w:numPr>
           <w:ilvl w:val="0"/>
-          <w:numId w:val="1016"/>
+          <w:numId w:val="1025"/>
         </w:numPr>
       </w:pPr>
       <w:r>
@@ -9366,7 +10542,7 @@
         <w:t xml:space="preserve">To implement this behaviour, add additional properties to both WCMP2 and WNM as follows:</w:t>
       </w:r>
     </w:p>
-    <w:bookmarkStart w:id="83" w:name="Xcb2d18af6f1a6acd572aa20521978471fa63ffa"/>
+    <w:bookmarkStart w:id="97" w:name="Xcb2d18af6f1a6acd572aa20521978471fa63ffa"/>
     <w:p>
       <w:pPr>
         <w:pStyle w:val="Heading3"/>
@@ -9913,7 +11089,7 @@
       <w:pPr>
         <w:numPr>
           <w:ilvl w:val="0"/>
-          <w:numId w:val="1017"/>
+          <w:numId w:val="1026"/>
         </w:numPr>
       </w:pPr>
       <w:r>
@@ -9924,7 +11100,7 @@
       <w:pPr>
         <w:numPr>
           <w:ilvl w:val="0"/>
-          <w:numId w:val="1017"/>
+          <w:numId w:val="1026"/>
         </w:numPr>
       </w:pPr>
       <w:r>
@@ -9940,8 +11116,8 @@
         <w:t xml:space="preserve">properties.wigos_station_identifier = "0-20000-0-71628"</w:t>
       </w:r>
     </w:p>
-    <w:bookmarkEnd w:id="83"/>
-    <w:bookmarkStart w:id="85" w:name="Xab35258ebace47dee618d284042b077f0112cb8"/>
+    <w:bookmarkEnd w:id="97"/>
+    <w:bookmarkStart w:id="99" w:name="Xab35258ebace47dee618d284042b077f0112cb8"/>
     <w:p>
       <w:pPr>
         <w:pStyle w:val="Heading3"/>
@@ -10815,7 +11991,7 @@
       <w:pPr>
         <w:numPr>
           <w:ilvl w:val="0"/>
-          <w:numId w:val="1018"/>
+          <w:numId w:val="1027"/>
         </w:numPr>
       </w:pPr>
       <w:r>
@@ -10854,7 +12030,7 @@
       <w:r>
         <w:t xml:space="preserve"> </w:t>
       </w:r>
-      <w:hyperlink r:id="rId84">
+      <w:hyperlink r:id="rId98">
         <w:r>
           <w:rPr>
             <w:rStyle w:val="Hyperlink"/>
@@ -10867,7 +12043,7 @@
       <w:pPr>
         <w:numPr>
           <w:ilvl w:val="0"/>
-          <w:numId w:val="1018"/>
+          <w:numId w:val="1027"/>
         </w:numPr>
       </w:pPr>
       <w:r>
@@ -10901,7 +12077,7 @@
       <w:pPr>
         <w:numPr>
           <w:ilvl w:val="0"/>
-          <w:numId w:val="1019"/>
+          <w:numId w:val="1028"/>
         </w:numPr>
       </w:pPr>
       <w:r>
@@ -10912,7 +12088,7 @@
       <w:pPr>
         <w:numPr>
           <w:ilvl w:val="0"/>
-          <w:numId w:val="1019"/>
+          <w:numId w:val="1028"/>
         </w:numPr>
       </w:pPr>
       <w:r>
@@ -12162,9 +13338,9 @@
         <w:t xml:space="preserve">    run()</w:t>
       </w:r>
     </w:p>
-    <w:bookmarkEnd w:id="85"/>
-    <w:bookmarkEnd w:id="86"/>
-    <w:bookmarkStart w:id="106" w:name="X995cd585ef30d7db82fa8cb8b475d4735b246d7"/>
+    <w:bookmarkEnd w:id="99"/>
+    <w:bookmarkEnd w:id="100"/>
+    <w:bookmarkStart w:id="119" w:name="X995cd585ef30d7db82fa8cb8b475d4735b246d7"/>
     <w:p>
       <w:pPr>
         <w:pStyle w:val="Heading2"/>
@@ -12183,7 +13359,7 @@
       <w:r>
         <w:t xml:space="preserve"> </w:t>
       </w:r>
-      <w:hyperlink r:id="rId87">
+      <w:hyperlink r:id="rId56">
         <w:r>
           <w:rPr>
             <w:rStyle w:val="Hyperlink"/>
@@ -12329,7 +13505,7 @@
       <w:pPr>
         <w:numPr>
           <w:ilvl w:val="0"/>
-          <w:numId w:val="1020"/>
+          <w:numId w:val="1029"/>
         </w:numPr>
       </w:pPr>
       <w:r>
@@ -12338,7 +13514,7 @@
       <w:r>
         <w:t xml:space="preserve"> </w:t>
       </w:r>
-      <w:hyperlink r:id="rId88">
+      <w:hyperlink r:id="rId101">
         <w:r>
           <w:rPr>
             <w:rStyle w:val="Hyperlink"/>
@@ -12355,7 +13531,7 @@
       <w:r>
         <w:t xml:space="preserve"> </w:t>
       </w:r>
-      <w:hyperlink r:id="rId89">
+      <w:hyperlink r:id="rId102">
         <w:r>
           <w:rPr>
             <w:rStyle w:val="Hyperlink"/>
@@ -12368,7 +13544,7 @@
       <w:pPr>
         <w:numPr>
           <w:ilvl w:val="0"/>
-          <w:numId w:val="1020"/>
+          <w:numId w:val="1029"/>
         </w:numPr>
       </w:pPr>
       <w:r>
@@ -12407,7 +13583,7 @@
       <w:pPr>
         <w:numPr>
           <w:ilvl w:val="0"/>
-          <w:numId w:val="1020"/>
+          <w:numId w:val="1029"/>
         </w:numPr>
       </w:pPr>
       <w:r>
@@ -12418,7 +13594,7 @@
       <w:pPr>
         <w:numPr>
           <w:ilvl w:val="0"/>
-          <w:numId w:val="1020"/>
+          <w:numId w:val="1029"/>
         </w:numPr>
       </w:pPr>
       <w:r>
@@ -12449,18 +13625,18 @@
           <wp:inline>
             <wp:extent cx="5334000" cy="3091799"/>
             <wp:effectExtent b="0" l="0" r="0" t="0"/>
-            <wp:docPr descr="WIS2 GDC online validator" title="" id="91" name="Picture"/>
+            <wp:docPr descr="WIS2 GDC online validator" title="" id="104" name="Picture"/>
             <a:graphic>
               <a:graphicData uri="http://schemas.openxmlformats.org/drawingml/2006/picture">
                 <pic:pic>
                   <pic:nvPicPr>
-                    <pic:cNvPr descr="images/data-publishers-wcmp2-validate-request-copy-paste.png" id="92" name="Picture"/>
+                    <pic:cNvPr descr="images/data-publishers-wcmp2-validate-request-copy-paste.png" id="105" name="Picture"/>
                     <pic:cNvPicPr>
                       <a:picLocks noChangeArrowheads="1" noChangeAspect="1"/>
                     </pic:cNvPicPr>
                   </pic:nvPicPr>
                   <pic:blipFill>
-                    <a:blip r:embed="rId90"/>
+                    <a:blip r:embed="rId103"/>
                     <a:stretch>
                       <a:fillRect/>
                     </a:stretch>
@@ -12512,18 +13688,18 @@
           <wp:inline>
             <wp:extent cx="5334000" cy="3511176"/>
             <wp:effectExtent b="0" l="0" r="0" t="0"/>
-            <wp:docPr descr="WIS2 GDC online validator" title="" id="94" name="Picture"/>
+            <wp:docPr descr="WIS2 GDC online validator" title="" id="107" name="Picture"/>
             <a:graphic>
               <a:graphicData uri="http://schemas.openxmlformats.org/drawingml/2006/picture">
                 <pic:pic>
                   <pic:nvPicPr>
-                    <pic:cNvPr descr="images/data-publishers-wcmp2-validate-request-url.png" id="95" name="Picture"/>
+                    <pic:cNvPr descr="images/data-publishers-wcmp2-validate-request-url.png" id="108" name="Picture"/>
                     <pic:cNvPicPr>
                       <a:picLocks noChangeArrowheads="1" noChangeAspect="1"/>
                     </pic:cNvPicPr>
                   </pic:nvPicPr>
                   <pic:blipFill>
-                    <a:blip r:embed="rId93"/>
+                    <a:blip r:embed="rId106"/>
                     <a:stretch>
                       <a:fillRect/>
                     </a:stretch>
@@ -12562,7 +13738,7 @@
       <w:pPr>
         <w:numPr>
           <w:ilvl w:val="0"/>
-          <w:numId w:val="1021"/>
+          <w:numId w:val="1030"/>
         </w:numPr>
       </w:pPr>
       <w:r>
@@ -12578,18 +13754,18 @@
           <wp:inline>
             <wp:extent cx="5334000" cy="4835460"/>
             <wp:effectExtent b="0" l="0" r="0" t="0"/>
-            <wp:docPr descr="WIS2 GDC online validator" title="" id="97" name="Picture"/>
+            <wp:docPr descr="WIS2 GDC online validator" title="" id="110" name="Picture"/>
             <a:graphic>
               <a:graphicData uri="http://schemas.openxmlformats.org/drawingml/2006/picture">
                 <pic:pic>
                   <pic:nvPicPr>
-                    <pic:cNvPr descr="images/data-publishers-wcmp2-validate-response.png" id="98" name="Picture"/>
+                    <pic:cNvPr descr="images/data-publishers-wcmp2-validate-response.png" id="111" name="Picture"/>
                     <pic:cNvPicPr>
                       <a:picLocks noChangeArrowheads="1" noChangeAspect="1"/>
                     </pic:cNvPicPr>
                   </pic:nvPicPr>
                   <pic:blipFill>
-                    <a:blip r:embed="rId96"/>
+                    <a:blip r:embed="rId109"/>
                     <a:stretch>
                       <a:fillRect/>
                     </a:stretch>
@@ -12642,7 +13818,7 @@
       <w:r>
         <w:t xml:space="preserve"> </w:t>
       </w:r>
-      <w:hyperlink r:id="rId99">
+      <w:hyperlink r:id="rId112">
         <w:r>
           <w:rPr>
             <w:rStyle w:val="Hyperlink"/>
@@ -12747,18 +13923,18 @@
           <wp:inline>
             <wp:extent cx="5334000" cy="3552256"/>
             <wp:effectExtent b="0" l="0" r="0" t="0"/>
-            <wp:docPr descr="WIS2 GDC quality assessment checker" title="" id="101" name="Picture"/>
+            <wp:docPr descr="WIS2 GDC quality assessment checker" title="" id="114" name="Picture"/>
             <a:graphic>
               <a:graphicData uri="http://schemas.openxmlformats.org/drawingml/2006/picture">
                 <pic:pic>
                   <pic:nvPicPr>
-                    <pic:cNvPr descr="images/data-publishers-wcmp2-quality-assess-request-url.png" id="102" name="Picture"/>
+                    <pic:cNvPr descr="images/data-publishers-wcmp2-quality-assess-request-url.png" id="115" name="Picture"/>
                     <pic:cNvPicPr>
                       <a:picLocks noChangeArrowheads="1" noChangeAspect="1"/>
                     </pic:cNvPicPr>
                   </pic:nvPicPr>
                   <pic:blipFill>
-                    <a:blip r:embed="rId100"/>
+                    <a:blip r:embed="rId113"/>
                     <a:stretch>
                       <a:fillRect/>
                     </a:stretch>
@@ -12802,18 +13978,18 @@
           <wp:inline>
             <wp:extent cx="5334000" cy="3955423"/>
             <wp:effectExtent b="0" l="0" r="0" t="0"/>
-            <wp:docPr descr="WIS2 GDC online quality assessment checker" title="" id="104" name="Picture"/>
+            <wp:docPr descr="WIS2 GDC online quality assessment checker" title="" id="117" name="Picture"/>
             <a:graphic>
               <a:graphicData uri="http://schemas.openxmlformats.org/drawingml/2006/picture">
                 <pic:pic>
                   <pic:nvPicPr>
-                    <pic:cNvPr descr="images/data-publishers-wcmp2-quality-assess-response.png" id="105" name="Picture"/>
+                    <pic:cNvPr descr="images/data-publishers-wcmp2-quality-assess-response.png" id="118" name="Picture"/>
                     <pic:cNvPicPr>
                       <a:picLocks noChangeArrowheads="1" noChangeAspect="1"/>
                     </pic:cNvPicPr>
                   </pic:nvPicPr>
                   <pic:blipFill>
-                    <a:blip r:embed="rId103"/>
+                    <a:blip r:embed="rId116"/>
                     <a:stretch>
                       <a:fillRect/>
                     </a:stretch>
@@ -12856,8 +14032,8 @@
         <w:t xml:space="preserve">A response will be provided with quality assessment results (in a similar format to the validation report).</w:t>
       </w:r>
     </w:p>
-    <w:bookmarkEnd w:id="106"/>
-    <w:bookmarkStart w:id="109" w:name="Xc6c976515be8accc6e30c5d2dc57ee1e3f0de9f"/>
+    <w:bookmarkEnd w:id="119"/>
+    <w:bookmarkStart w:id="122" w:name="Xc6c976515be8accc6e30c5d2dc57ee1e3f0de9f"/>
     <w:p>
       <w:pPr>
         <w:pStyle w:val="Heading2"/>
@@ -12876,7 +14052,7 @@
       <w:r>
         <w:t xml:space="preserve"> </w:t>
       </w:r>
-      <w:hyperlink r:id="rId77">
+      <w:hyperlink r:id="rId91">
         <w:r>
           <w:rPr>
             <w:rStyle w:val="Hyperlink"/>
@@ -12893,7 +14069,7 @@
       <w:r>
         <w:t xml:space="preserve"> </w:t>
       </w:r>
-      <w:hyperlink r:id="rId107">
+      <w:hyperlink r:id="rId120">
         <w:r>
           <w:rPr>
             <w:rStyle w:val="Hyperlink"/>
@@ -13034,7 +14210,7 @@
       <w:r>
         <w:t xml:space="preserve"> </w:t>
       </w:r>
-      <w:hyperlink r:id="rId108">
+      <w:hyperlink r:id="rId121">
         <w:r>
           <w:rPr>
             <w:rStyle w:val="Hyperlink"/>
@@ -13168,8 +14344,8 @@
         <w:t xml:space="preserve"> ets validate https://example.org/path/to/file.json</w:t>
       </w:r>
     </w:p>
-    <w:bookmarkEnd w:id="109"/>
-    <w:bookmarkStart w:id="112" w:name="Xe1ab91c92858aeaa2b77f27e6d6761862038204"/>
+    <w:bookmarkEnd w:id="122"/>
+    <w:bookmarkStart w:id="125" w:name="Xe1ab91c92858aeaa2b77f27e6d6761862038204"/>
     <w:p>
       <w:pPr>
         <w:pStyle w:val="Heading2"/>
@@ -13188,7 +14364,7 @@
       <w:r>
         <w:t xml:space="preserve"> </w:t>
       </w:r>
-      <w:hyperlink r:id="rId110">
+      <w:hyperlink r:id="rId123">
         <w:r>
           <w:rPr>
             <w:rStyle w:val="Hyperlink"/>
@@ -13202,7 +14378,7 @@
       <w:r>
         <w:t xml:space="preserve"> </w:t>
       </w:r>
-      <w:hyperlink r:id="rId99">
+      <w:hyperlink r:id="rId112">
         <w:r>
           <w:rPr>
             <w:rStyle w:val="Hyperlink"/>
@@ -13224,7 +14400,7 @@
       <w:r>
         <w:t xml:space="preserve"> </w:t>
       </w:r>
-      <w:hyperlink r:id="rId111">
+      <w:hyperlink r:id="rId124">
         <w:r>
           <w:rPr>
             <w:rStyle w:val="Hyperlink"/>
@@ -13255,7 +14431,7 @@
       <w:pPr>
         <w:numPr>
           <w:ilvl w:val="0"/>
-          <w:numId w:val="1022"/>
+          <w:numId w:val="1031"/>
         </w:numPr>
       </w:pPr>
       <w:r>
@@ -13314,8 +14490,8 @@
         <w:t xml:space="preserve">payload of the WCMP2 ETS/KPI reports.</w:t>
       </w:r>
     </w:p>
-    <w:bookmarkEnd w:id="112"/>
-    <w:bookmarkStart w:id="128" w:name="X97b60fc307c302390131e472d6cc89355e84cb1"/>
+    <w:bookmarkEnd w:id="125"/>
+    <w:bookmarkStart w:id="141" w:name="X97b60fc307c302390131e472d6cc89355e84cb1"/>
     <w:p>
       <w:pPr>
         <w:pStyle w:val="Heading2"/>
@@ -13332,7 +14508,7 @@
         <w:t xml:space="preserve">The below recipe provides user requirements specifications for the implementation of a WIS 2.0 Node.</w:t>
       </w:r>
     </w:p>
-    <w:bookmarkStart w:id="127" w:name="Xcd14ed162d40e716576cc34615e8a6eb13dc224"/>
+    <w:bookmarkStart w:id="140" w:name="Xcd14ed162d40e716576cc34615e8a6eb13dc224"/>
     <w:p>
       <w:pPr>
         <w:pStyle w:val="Heading3"/>
@@ -13341,7 +14517,7 @@
         <w:t xml:space="preserve">WIS 2.0 Node - User requirements specifications</w:t>
       </w:r>
     </w:p>
-    <w:bookmarkStart w:id="117" w:name="Xe91cf87d25b98be0b83690164d6c9c93cd8e334"/>
+    <w:bookmarkStart w:id="130" w:name="Xe91cf87d25b98be0b83690164d6c9c93cd8e334"/>
     <w:p>
       <w:pPr>
         <w:pStyle w:val="Heading4"/>
@@ -13350,7 +14526,7 @@
         <w:t xml:space="preserve">Introduction</w:t>
       </w:r>
     </w:p>
-    <w:bookmarkStart w:id="113" w:name="Xc7fa6cde978045068a438b2eca1f48e05e062c2"/>
+    <w:bookmarkStart w:id="126" w:name="Xc7fa6cde978045068a438b2eca1f48e05e062c2"/>
     <w:p>
       <w:pPr>
         <w:pStyle w:val="Heading5"/>
@@ -13457,8 +14633,8 @@
         </w:tc>
       </w:tr>
     </w:tbl>
-    <w:bookmarkEnd w:id="113"/>
-    <w:bookmarkStart w:id="116" w:name="X88ff7d11dee1dfde71fa338892e94a3d31139a2"/>
+    <w:bookmarkEnd w:id="126"/>
+    <w:bookmarkStart w:id="129" w:name="X88ff7d11dee1dfde71fa338892e94a3d31139a2"/>
     <w:p>
       <w:pPr>
         <w:pStyle w:val="Heading5"/>
@@ -13633,7 +14809,7 @@
             <w:pPr>
               <w:jc w:val="left"/>
             </w:pPr>
-            <w:hyperlink r:id="rId114">
+            <w:hyperlink r:id="rId127">
               <w:r>
                 <w:rPr>
                   <w:rStyle w:val="Hyperlink"/>
@@ -13673,7 +14849,7 @@
             <w:pPr>
               <w:jc w:val="left"/>
             </w:pPr>
-            <w:hyperlink r:id="rId115">
+            <w:hyperlink r:id="rId128">
               <w:r>
                 <w:rPr>
                   <w:rStyle w:val="Hyperlink"/>
@@ -13685,9 +14861,9 @@
         </w:tc>
       </w:tr>
     </w:tbl>
-    <w:bookmarkEnd w:id="116"/>
-    <w:bookmarkEnd w:id="117"/>
-    <w:bookmarkStart w:id="124" w:name="Xc05907125c3cf40fd23d41a88d871af00b86aaf"/>
+    <w:bookmarkEnd w:id="129"/>
+    <w:bookmarkEnd w:id="130"/>
+    <w:bookmarkStart w:id="137" w:name="Xc05907125c3cf40fd23d41a88d871af00b86aaf"/>
     <w:p>
       <w:pPr>
         <w:pStyle w:val="Heading4"/>
@@ -13696,7 +14872,7 @@
         <w:t xml:space="preserve">System overview</w:t>
       </w:r>
     </w:p>
-    <w:bookmarkStart w:id="121" w:name="Xa8dec8d22c30173039f739fc28a51d15d188989"/>
+    <w:bookmarkStart w:id="134" w:name="Xa8dec8d22c30173039f739fc28a51d15d188989"/>
     <w:p>
       <w:pPr>
         <w:pStyle w:val="Heading5"/>
@@ -13745,7 +14921,7 @@
       <w:pPr>
         <w:numPr>
           <w:ilvl w:val="0"/>
-          <w:numId w:val="1023"/>
+          <w:numId w:val="1032"/>
         </w:numPr>
       </w:pPr>
       <w:r>
@@ -13756,7 +14932,7 @@
       <w:pPr>
         <w:numPr>
           <w:ilvl w:val="0"/>
-          <w:numId w:val="1023"/>
+          <w:numId w:val="1032"/>
         </w:numPr>
       </w:pPr>
       <w:r>
@@ -13767,7 +14943,7 @@
       <w:pPr>
         <w:numPr>
           <w:ilvl w:val="0"/>
-          <w:numId w:val="1023"/>
+          <w:numId w:val="1032"/>
         </w:numPr>
       </w:pPr>
       <w:r>
@@ -13778,7 +14954,7 @@
       <w:pPr>
         <w:numPr>
           <w:ilvl w:val="0"/>
-          <w:numId w:val="1023"/>
+          <w:numId w:val="1032"/>
         </w:numPr>
       </w:pPr>
       <w:r>
@@ -13789,7 +14965,7 @@
       <w:pPr>
         <w:numPr>
           <w:ilvl w:val="0"/>
-          <w:numId w:val="1023"/>
+          <w:numId w:val="1032"/>
         </w:numPr>
       </w:pPr>
       <w:r>
@@ -13805,18 +14981,18 @@
           <wp:inline>
             <wp:extent cx="5334000" cy="3355258"/>
             <wp:effectExtent b="0" l="0" r="0" t="0"/>
-            <wp:docPr descr="WIS 2.0 Node context diagram" title="" id="119" name="Picture"/>
+            <wp:docPr descr="WIS 2.0 Node context diagram" title="" id="132" name="Picture"/>
             <a:graphic>
               <a:graphicData uri="http://schemas.openxmlformats.org/drawingml/2006/picture">
                 <pic:pic>
                   <pic:nvPicPr>
-                    <pic:cNvPr descr="images/wis2node-context-diagram.jpg" id="120" name="Picture"/>
+                    <pic:cNvPr descr="images/wis2node-context-diagram.jpg" id="133" name="Picture"/>
                     <pic:cNvPicPr>
                       <a:picLocks noChangeArrowheads="1" noChangeAspect="1"/>
                     </pic:cNvPicPr>
                   </pic:nvPicPr>
                   <pic:blipFill>
-                    <a:blip r:embed="rId118"/>
+                    <a:blip r:embed="rId131"/>
                     <a:stretch>
                       <a:fillRect/>
                     </a:stretch>
@@ -13851,8 +15027,8 @@
         <w:t xml:space="preserve">WIS 2.0 Node context diagram</w:t>
       </w:r>
     </w:p>
-    <w:bookmarkEnd w:id="121"/>
-    <w:bookmarkStart w:id="122" w:name="X03b52fc7925300f0fe887bc5e8a2b3cab55a9fa"/>
+    <w:bookmarkEnd w:id="134"/>
+    <w:bookmarkStart w:id="135" w:name="X03b52fc7925300f0fe887bc5e8a2b3cab55a9fa"/>
     <w:p>
       <w:pPr>
         <w:pStyle w:val="Heading5"/>
@@ -13893,8 +15069,8 @@
         <w:t xml:space="preserve">End users will retrieve core data not retained by the Global Caches from the Node by accessing the HTTP server on the Node. End users will also retrieve recommended data from the Node by accessing the HTTP server on the Node, subject to appropriate access control.</w:t>
       </w:r>
     </w:p>
-    <w:bookmarkEnd w:id="122"/>
-    <w:bookmarkStart w:id="123" w:name="X5ee9c34866c3deedf0b9ae9da8ed9bcc24954ef"/>
+    <w:bookmarkEnd w:id="135"/>
+    <w:bookmarkStart w:id="136" w:name="X5ee9c34866c3deedf0b9ae9da8ed9bcc24954ef"/>
     <w:p>
       <w:pPr>
         <w:pStyle w:val="Heading5"/>
@@ -13911,9 +15087,9 @@
         <w:t xml:space="preserve">The WIS 2.0 Node will be compliant with the Manual on WMO Information System Volume II. WMO Information System 2.0 [AD-0].</w:t>
       </w:r>
     </w:p>
-    <w:bookmarkEnd w:id="123"/>
-    <w:bookmarkEnd w:id="124"/>
-    <w:bookmarkStart w:id="126" w:name="Xb36dc7b818e26c0d3e58073065d9f03d91fe5fb"/>
+    <w:bookmarkEnd w:id="136"/>
+    <w:bookmarkEnd w:id="137"/>
+    <w:bookmarkStart w:id="139" w:name="Xb36dc7b818e26c0d3e58073065d9f03d91fe5fb"/>
     <w:p>
       <w:pPr>
         <w:pStyle w:val="Heading4"/>
@@ -14322,7 +15498,7 @@
         <w:t xml:space="preserve">The Node shall support the retrieval core data by the WIS 2.0 Global Caches.</w:t>
       </w:r>
     </w:p>
-    <w:bookmarkStart w:id="125" w:name="Xd3b20c3a6552aab5b0df48d69f28edd9078e98d"/>
+    <w:bookmarkStart w:id="138" w:name="Xd3b20c3a6552aab5b0df48d69f28edd9078e98d"/>
     <w:p>
       <w:pPr>
         <w:pStyle w:val="Heading5"/>
@@ -14483,12 +15659,12 @@
         <w:t xml:space="preserve">3.6.3.2 See also 4.7 (WIS-TechSpec-6: Managing operations of the WIS).</w:t>
       </w:r>
     </w:p>
-    <w:bookmarkEnd w:id="125"/>
-    <w:bookmarkEnd w:id="126"/>
-    <w:bookmarkEnd w:id="127"/>
-    <w:bookmarkEnd w:id="128"/>
-    <w:bookmarkEnd w:id="129"/>
-    <w:bookmarkStart w:id="147" w:name="Xc4b6438d20a4843744ed7af7618fd94dd0f800b"/>
+    <w:bookmarkEnd w:id="138"/>
+    <w:bookmarkEnd w:id="139"/>
+    <w:bookmarkEnd w:id="140"/>
+    <w:bookmarkEnd w:id="141"/>
+    <w:bookmarkEnd w:id="142"/>
+    <w:bookmarkStart w:id="160" w:name="Xc4b6438d20a4843744ed7af7618fd94dd0f800b"/>
     <w:p>
       <w:pPr>
         <w:pStyle w:val="Heading1"/>
@@ -14497,7 +15673,7 @@
         <w:t xml:space="preserve">Recipes for Earth system discipline domain experts</w:t>
       </w:r>
     </w:p>
-    <w:bookmarkStart w:id="138" w:name="Xb654c803f0f544395eae871195f180d4a62fc41"/>
+    <w:bookmarkStart w:id="151" w:name="Xb654c803f0f544395eae871195f180d4a62fc41"/>
     <w:p>
       <w:pPr>
         <w:pStyle w:val="Heading2"/>
@@ -14516,7 +15692,7 @@
       <w:r>
         <w:t xml:space="preserve"> </w:t>
       </w:r>
-      <w:hyperlink r:id="rId130">
+      <w:hyperlink r:id="rId143">
         <w:r>
           <w:rPr>
             <w:rStyle w:val="Hyperlink"/>
@@ -14539,7 +15715,7 @@
         <w:t xml:space="preserve">The purpose of this document is to provide guidelines to domain experts so that the Topic Hierarchy definition is consistent and useful to address the needs of WIS2 users.</w:t>
       </w:r>
     </w:p>
-    <w:bookmarkStart w:id="132" w:name="Xe0282727fd4a9fed5ac81d57108bc75c27eca25"/>
+    <w:bookmarkStart w:id="145" w:name="Xe0282727fd4a9fed5ac81d57108bc75c27eca25"/>
     <w:p>
       <w:pPr>
         <w:pStyle w:val="Heading3"/>
@@ -14560,7 +15736,7 @@
       <w:pPr>
         <w:numPr>
           <w:ilvl w:val="0"/>
-          <w:numId w:val="1024"/>
+          <w:numId w:val="1033"/>
         </w:numPr>
       </w:pPr>
       <w:r>
@@ -14574,7 +15750,7 @@
       <w:pPr>
         <w:numPr>
           <w:ilvl w:val="0"/>
-          <w:numId w:val="1024"/>
+          <w:numId w:val="1033"/>
         </w:numPr>
       </w:pPr>
       <w:r>
@@ -14588,7 +15764,7 @@
       <w:pPr>
         <w:numPr>
           <w:ilvl w:val="0"/>
-          <w:numId w:val="1024"/>
+          <w:numId w:val="1033"/>
         </w:numPr>
       </w:pPr>
       <w:r>
@@ -14608,7 +15784,7 @@
       <w:r>
         <w:t xml:space="preserve"> </w:t>
       </w:r>
-      <w:hyperlink r:id="rId131">
+      <w:hyperlink r:id="rId144">
         <w:r>
           <w:rPr>
             <w:rStyle w:val="Hyperlink"/>
@@ -14627,7 +15803,7 @@
       <w:pPr>
         <w:numPr>
           <w:ilvl w:val="0"/>
-          <w:numId w:val="1025"/>
+          <w:numId w:val="1034"/>
         </w:numPr>
       </w:pPr>
       <w:r>
@@ -14641,7 +15817,7 @@
       <w:pPr>
         <w:numPr>
           <w:ilvl w:val="0"/>
-          <w:numId w:val="1025"/>
+          <w:numId w:val="1034"/>
         </w:numPr>
       </w:pPr>
       <w:r>
@@ -14655,7 +15831,7 @@
       <w:pPr>
         <w:numPr>
           <w:ilvl w:val="0"/>
-          <w:numId w:val="1025"/>
+          <w:numId w:val="1034"/>
         </w:numPr>
       </w:pPr>
       <w:r>
@@ -14669,7 +15845,7 @@
       <w:pPr>
         <w:numPr>
           <w:ilvl w:val="0"/>
-          <w:numId w:val="1025"/>
+          <w:numId w:val="1034"/>
         </w:numPr>
       </w:pPr>
       <w:r>
@@ -14683,7 +15859,7 @@
       <w:pPr>
         <w:numPr>
           <w:ilvl w:val="0"/>
-          <w:numId w:val="1025"/>
+          <w:numId w:val="1034"/>
         </w:numPr>
       </w:pPr>
       <w:r>
@@ -14697,7 +15873,7 @@
       <w:pPr>
         <w:numPr>
           <w:ilvl w:val="0"/>
-          <w:numId w:val="1025"/>
+          <w:numId w:val="1034"/>
         </w:numPr>
       </w:pPr>
       <w:r>
@@ -14711,7 +15887,7 @@
       <w:pPr>
         <w:numPr>
           <w:ilvl w:val="0"/>
-          <w:numId w:val="1025"/>
+          <w:numId w:val="1034"/>
         </w:numPr>
       </w:pPr>
       <w:r>
@@ -14729,8 +15905,8 @@
         <w:t xml:space="preserve">Topics within each Earth system discipline are then defined by domain experts, reviewed, approved, and published by WMO.</w:t>
       </w:r>
     </w:p>
-    <w:bookmarkEnd w:id="132"/>
-    <w:bookmarkStart w:id="135" w:name="Xbdd8b194128916b8e4e6c521e41ceb6ee17bc29"/>
+    <w:bookmarkEnd w:id="145"/>
+    <w:bookmarkStart w:id="148" w:name="Xbdd8b194128916b8e4e6c521e41ceb6ee17bc29"/>
     <w:p>
       <w:pPr>
         <w:pStyle w:val="Heading3"/>
@@ -14739,7 +15915,7 @@
         <w:t xml:space="preserve">Additional Earth domain specific topics levels</w:t>
       </w:r>
     </w:p>
-    <w:bookmarkStart w:id="133" w:name="X429274356a9e762a791e593bc50f3fcc6666df0"/>
+    <w:bookmarkStart w:id="146" w:name="X429274356a9e762a791e593bc50f3fcc6666df0"/>
     <w:p>
       <w:pPr>
         <w:pStyle w:val="Heading4"/>
@@ -14756,8 +15932,8 @@
         <w:t xml:space="preserve">The definition of the Topic Hierarchy is heavily linked to the use of Publish-Subscribe (Pub/Sub) protocols, here MQTT[S], in WIS2. Users, when subscribing to the Global Broker, can decide which notification messages they wish to receive.</w:t>
       </w:r>
     </w:p>
-    <w:bookmarkEnd w:id="133"/>
-    <w:bookmarkStart w:id="134" w:name="Xa02a7281fbf38228bcbe9109d6a8236f2fd82e1"/>
+    <w:bookmarkEnd w:id="146"/>
+    <w:bookmarkStart w:id="147" w:name="Xa02a7281fbf38228bcbe9109d6a8236f2fd82e1"/>
     <w:p>
       <w:pPr>
         <w:pStyle w:val="Heading4"/>
@@ -14943,9 +16119,9 @@
         <w:t xml:space="preserve">The purpose of additional topic hierarchy levels is to allow users to get the messages they need and to be more specific in their request.</w:t>
       </w:r>
     </w:p>
-    <w:bookmarkEnd w:id="134"/>
-    <w:bookmarkEnd w:id="135"/>
-    <w:bookmarkStart w:id="137" w:name="Xf51e5d11ade866f2b10a11178e97f52d24a68d6"/>
+    <w:bookmarkEnd w:id="147"/>
+    <w:bookmarkEnd w:id="148"/>
+    <w:bookmarkStart w:id="150" w:name="Xf51e5d11ade866f2b10a11178e97f52d24a68d6"/>
     <w:p>
       <w:pPr>
         <w:pStyle w:val="Heading3"/>
@@ -15006,7 +16182,7 @@
       <w:r>
         <w:t xml:space="preserve"> </w:t>
       </w:r>
-      <w:hyperlink r:id="rId136">
+      <w:hyperlink r:id="rId149">
         <w:r>
           <w:rPr>
             <w:rStyle w:val="Hyperlink"/>
@@ -15852,9 +17028,9 @@
         <w:t xml:space="preserve">for more information on client side filtering</w:t>
       </w:r>
     </w:p>
-    <w:bookmarkEnd w:id="137"/>
-    <w:bookmarkEnd w:id="138"/>
-    <w:bookmarkStart w:id="146" w:name="X5e671a39a6d661dae4fb49f9c1a8a7ef641ba6a"/>
+    <w:bookmarkEnd w:id="150"/>
+    <w:bookmarkEnd w:id="151"/>
+    <w:bookmarkStart w:id="159" w:name="X5e671a39a6d661dae4fb49f9c1a8a7ef641ba6a"/>
     <w:p>
       <w:pPr>
         <w:pStyle w:val="Heading2"/>
@@ -15867,7 +17043,7 @@
       <w:pPr>
         <w:pStyle w:val="FirstParagraph"/>
       </w:pPr>
-      <w:hyperlink r:id="rId139">
+      <w:hyperlink r:id="rId152">
         <w:r>
           <w:rPr>
             <w:rStyle w:val="Hyperlink"/>
@@ -15894,7 +17070,7 @@
       <w:pPr>
         <w:numPr>
           <w:ilvl w:val="0"/>
-          <w:numId w:val="1026"/>
+          <w:numId w:val="1035"/>
         </w:numPr>
       </w:pPr>
       <w:r>
@@ -15905,7 +17081,7 @@
       <w:pPr>
         <w:numPr>
           <w:ilvl w:val="0"/>
-          <w:numId w:val="1026"/>
+          <w:numId w:val="1035"/>
         </w:numPr>
       </w:pPr>
       <w:r>
@@ -15916,7 +17092,7 @@
       <w:pPr>
         <w:numPr>
           <w:ilvl w:val="0"/>
-          <w:numId w:val="1026"/>
+          <w:numId w:val="1035"/>
         </w:numPr>
       </w:pPr>
       <w:r>
@@ -15931,7 +17107,7 @@
         <w:t xml:space="preserve">Profiling WCMP2 can enable domain communities achieve deeper interoperability (or tighter coupling) to meet their needs. For example, an NWP profile of WCMP2 may drive a user-focused NWP portal which leverages domain specific properties of a WCMP2 record for more meaningful search results and assessment for use.</w:t>
       </w:r>
     </w:p>
-    <w:bookmarkStart w:id="140" w:name="Xade372fc2491823cbd5a4e26ab535aef0b99235"/>
+    <w:bookmarkStart w:id="153" w:name="Xade372fc2491823cbd5a4e26ab535aef0b99235"/>
     <w:p>
       <w:pPr>
         <w:pStyle w:val="Heading3"/>
@@ -15952,7 +17128,7 @@
       <w:pPr>
         <w:numPr>
           <w:ilvl w:val="0"/>
-          <w:numId w:val="1027"/>
+          <w:numId w:val="1036"/>
         </w:numPr>
       </w:pPr>
       <w:r>
@@ -15963,7 +17139,7 @@
       <w:pPr>
         <w:numPr>
           <w:ilvl w:val="0"/>
-          <w:numId w:val="1027"/>
+          <w:numId w:val="1036"/>
         </w:numPr>
       </w:pPr>
       <w:r>
@@ -15974,15 +17150,15 @@
       <w:pPr>
         <w:numPr>
           <w:ilvl w:val="0"/>
-          <w:numId w:val="1027"/>
+          <w:numId w:val="1036"/>
         </w:numPr>
       </w:pPr>
       <w:r>
         <w:t xml:space="preserve">sustainability: while developing a WCMP2 extension can be worthwhile metadata modelling exercise, ensure that there is a team in place to help maintain the extension over time. This means having clear ownership of a WCMP2 extension that is subject to ongoing review, and supporting user questions, issues, enhancements and bug fixes</w:t>
       </w:r>
     </w:p>
-    <w:bookmarkEnd w:id="140"/>
-    <w:bookmarkStart w:id="144" w:name="X8f3942b300354a689a365ca72a70459ee50a7e2"/>
+    <w:bookmarkEnd w:id="153"/>
+    <w:bookmarkStart w:id="157" w:name="X8f3942b300354a689a365ca72a70459ee50a7e2"/>
     <w:p>
       <w:pPr>
         <w:pStyle w:val="Heading3"/>
@@ -16001,7 +17177,7 @@
       <w:r>
         <w:t xml:space="preserve"> </w:t>
       </w:r>
-      <w:hyperlink r:id="rId141">
+      <w:hyperlink r:id="rId154">
         <w:r>
           <w:rPr>
             <w:rStyle w:val="Hyperlink"/>
@@ -16015,7 +17191,7 @@
       <w:r>
         <w:t xml:space="preserve"> </w:t>
       </w:r>
-      <w:hyperlink r:id="rId142">
+      <w:hyperlink r:id="rId155">
         <w:r>
           <w:rPr>
             <w:rStyle w:val="Hyperlink"/>
@@ -16039,7 +17215,7 @@
       <w:pPr>
         <w:numPr>
           <w:ilvl w:val="0"/>
-          <w:numId w:val="1028"/>
+          <w:numId w:val="1037"/>
         </w:numPr>
       </w:pPr>
       <w:r>
@@ -16050,7 +17226,7 @@
       <w:pPr>
         <w:numPr>
           <w:ilvl w:val="1"/>
-          <w:numId w:val="1029"/>
+          <w:numId w:val="1038"/>
         </w:numPr>
       </w:pPr>
       <w:r>
@@ -16073,7 +17249,7 @@
       <w:pPr>
         <w:numPr>
           <w:ilvl w:val="1"/>
-          <w:numId w:val="1029"/>
+          <w:numId w:val="1038"/>
         </w:numPr>
       </w:pPr>
       <w:r>
@@ -16111,7 +17287,7 @@
       <w:pPr>
         <w:numPr>
           <w:ilvl w:val="1"/>
-          <w:numId w:val="1029"/>
+          <w:numId w:val="1038"/>
         </w:numPr>
       </w:pPr>
       <w:r>
@@ -16134,7 +17310,7 @@
       <w:pPr>
         <w:numPr>
           <w:ilvl w:val="2"/>
-          <w:numId w:val="1030"/>
+          <w:numId w:val="1039"/>
         </w:numPr>
       </w:pPr>
       <w:r>
@@ -16145,7 +17321,7 @@
       <w:pPr>
         <w:numPr>
           <w:ilvl w:val="2"/>
-          <w:numId w:val="1030"/>
+          <w:numId w:val="1039"/>
         </w:numPr>
       </w:pPr>
       <w:r>
@@ -16180,7 +17356,7 @@
       <w:pPr>
         <w:numPr>
           <w:ilvl w:val="2"/>
-          <w:numId w:val="1030"/>
+          <w:numId w:val="1039"/>
         </w:numPr>
       </w:pPr>
       <w:r>
@@ -16203,7 +17379,7 @@
       <w:pPr>
         <w:numPr>
           <w:ilvl w:val="2"/>
-          <w:numId w:val="1030"/>
+          <w:numId w:val="1039"/>
         </w:numPr>
       </w:pPr>
       <w:r>
@@ -16214,7 +17390,7 @@
       <w:pPr>
         <w:numPr>
           <w:ilvl w:val="2"/>
-          <w:numId w:val="1030"/>
+          <w:numId w:val="1039"/>
         </w:numPr>
       </w:pPr>
       <w:r>
@@ -16386,7 +17562,7 @@
       <w:r>
         <w:t xml:space="preserve"> </w:t>
       </w:r>
-      <w:hyperlink r:id="rId143">
+      <w:hyperlink r:id="rId156">
         <w:r>
           <w:rPr>
             <w:rStyle w:val="Hyperlink"/>
@@ -16398,8 +17574,8 @@
         <w:t xml:space="preserve">.</w:t>
       </w:r>
     </w:p>
-    <w:bookmarkEnd w:id="144"/>
-    <w:bookmarkStart w:id="145" w:name="Xac1f598518ca05fb80e7b58a9879a836c6dcb6f"/>
+    <w:bookmarkEnd w:id="157"/>
+    <w:bookmarkStart w:id="158" w:name="Xac1f598518ca05fb80e7b58a9879a836c6dcb6f"/>
     <w:p>
       <w:pPr>
         <w:pStyle w:val="Heading3"/>
@@ -16600,10 +17776,10 @@
         <w:t xml:space="preserve">This will allow a WCMP2 parser to detect additional conformance to a given Extension and validate accordingly (in addition to validating WCMP2 Core).</w:t>
       </w:r>
     </w:p>
-    <w:bookmarkEnd w:id="145"/>
-    <w:bookmarkEnd w:id="146"/>
-    <w:bookmarkEnd w:id="147"/>
-    <w:bookmarkStart w:id="148" w:name="X7704236ba72ed8cc2b9a9e238d27c640b9b6528"/>
+    <w:bookmarkEnd w:id="158"/>
+    <w:bookmarkEnd w:id="159"/>
+    <w:bookmarkEnd w:id="160"/>
+    <w:bookmarkStart w:id="161" w:name="X7704236ba72ed8cc2b9a9e238d27c640b9b6528"/>
     <w:p>
       <w:pPr>
         <w:pStyle w:val="Heading1"/>
@@ -16806,7 +17982,7 @@
         </w:tc>
       </w:tr>
     </w:tbl>
-    <w:bookmarkEnd w:id="148"/>
+    <w:bookmarkEnd w:id="161"/>
     <w:sectPr/>
   </w:body>
 </w:document>
@@ -16880,7 +18056,7 @@
       </w:hyperlink>
     </w:p>
   </w:footnote>
-  <w:footnote w:id="48">
+  <w:footnote w:id="62">
     <w:p>
       <w:pPr>
         <w:pStyle w:val="FootnoteText"/>
@@ -16894,7 +18070,7 @@
       <w:r>
         <w:t xml:space="preserve"> </w:t>
       </w:r>
-      <w:hyperlink r:id="rId49">
+      <w:hyperlink r:id="rId63">
         <w:r>
           <w:rPr>
             <w:rStyle w:val="Hyperlink"/>
@@ -16904,7 +18080,7 @@
       </w:hyperlink>
     </w:p>
   </w:footnote>
-  <w:footnote w:id="64">
+  <w:footnote w:id="78">
     <w:p>
       <w:pPr>
         <w:pStyle w:val="FootnoteText"/>
@@ -16918,7 +18094,7 @@
       <w:r>
         <w:t xml:space="preserve"> </w:t>
       </w:r>
-      <w:hyperlink r:id="rId65">
+      <w:hyperlink r:id="rId79">
         <w:r>
           <w:rPr>
             <w:rStyle w:val="Hyperlink"/>
@@ -16928,7 +18104,7 @@
       </w:hyperlink>
     </w:p>
   </w:footnote>
-  <w:footnote w:id="67">
+  <w:footnote w:id="81">
     <w:p>
       <w:pPr>
         <w:pStyle w:val="FootnoteText"/>
@@ -16942,7 +18118,7 @@
       <w:r>
         <w:t xml:space="preserve"> </w:t>
       </w:r>
-      <w:hyperlink r:id="rId68">
+      <w:hyperlink r:id="rId82">
         <w:r>
           <w:rPr>
             <w:rStyle w:val="Hyperlink"/>
@@ -17264,6 +18440,33 @@
     <w:abstractNumId w:val="991"/>
   </w:num>
   <w:num w:numId="1023">
+    <w:abstractNumId w:val="991"/>
+  </w:num>
+  <w:num w:numId="1024">
+    <w:abstractNumId w:val="991"/>
+  </w:num>
+  <w:num w:numId="1025">
+    <w:abstractNumId w:val="991"/>
+  </w:num>
+  <w:num w:numId="1026">
+    <w:abstractNumId w:val="991"/>
+  </w:num>
+  <w:num w:numId="1027">
+    <w:abstractNumId w:val="991"/>
+  </w:num>
+  <w:num w:numId="1028">
+    <w:abstractNumId w:val="991"/>
+  </w:num>
+  <w:num w:numId="1029">
+    <w:abstractNumId w:val="991"/>
+  </w:num>
+  <w:num w:numId="1030">
+    <w:abstractNumId w:val="991"/>
+  </w:num>
+  <w:num w:numId="1031">
+    <w:abstractNumId w:val="991"/>
+  </w:num>
+  <w:num w:numId="1032">
     <w:abstractNumId w:val="99401"/>
     <w:lvlOverride w:ilvl="0">
       <w:startOverride w:val="1"/>
@@ -17293,25 +18496,25 @@
       <w:startOverride w:val="1"/>
     </w:lvlOverride>
   </w:num>
-  <w:num w:numId="1024">
+  <w:num w:numId="1033">
     <w:abstractNumId w:val="991"/>
   </w:num>
-  <w:num w:numId="1025">
+  <w:num w:numId="1034">
     <w:abstractNumId w:val="991"/>
   </w:num>
-  <w:num w:numId="1026">
+  <w:num w:numId="1035">
     <w:abstractNumId w:val="991"/>
   </w:num>
-  <w:num w:numId="1027">
+  <w:num w:numId="1036">
     <w:abstractNumId w:val="991"/>
   </w:num>
-  <w:num w:numId="1028">
+  <w:num w:numId="1037">
     <w:abstractNumId w:val="991"/>
   </w:num>
-  <w:num w:numId="1029">
+  <w:num w:numId="1038">
     <w:abstractNumId w:val="991"/>
   </w:num>
-  <w:num w:numId="1030">
+  <w:num w:numId="1039">
     <w:abstractNumId w:val="991"/>
   </w:num>
 </w:numbering>

</xml_diff>